<commit_message>
estudando a faculdade ne
</commit_message>
<xml_diff>
--- a/Faculdade/Semestre 1/Fundamentos de redes de computadores/Modelo OSI e Arquitetura TCP.IP.docx
+++ b/Faculdade/Semestre 1/Fundamentos de redes de computadores/Modelo OSI e Arquitetura TCP.IP.docx
@@ -3099,50 +3099,2270 @@
         </w:numPr>
         <w:rPr>
           <w:rFonts w:hint="default" w:ascii="Arial" w:hAnsi="Arial" w:cs="Arial"/>
-          <w:b w:val="0"/>
-          <w:bCs w:val="0"/>
-          <w:sz w:val="32"/>
-          <w:szCs w:val="32"/>
-          <w:lang w:val="pt-BR"/>
-        </w:rPr>
-      </w:pPr>
+          <w:b/>
+          <w:bCs/>
+          <w:sz w:val="32"/>
+          <w:szCs w:val="32"/>
+          <w:lang w:val="pt-BR"/>
+        </w:rPr>
+      </w:pPr>
+      <w:r>
+        <w:rPr>
+          <w:rFonts w:hint="default" w:ascii="Arial" w:hAnsi="Arial" w:cs="Arial"/>
+          <w:b/>
+          <w:bCs/>
+          <w:sz w:val="32"/>
+          <w:szCs w:val="32"/>
+          <w:lang w:val="pt-BR"/>
+        </w:rPr>
+        <w:t>Rede</w:t>
+      </w:r>
+    </w:p>
+    <w:p>
+      <w:pPr>
+        <w:numPr>
+          <w:numId w:val="0"/>
+        </w:numPr>
+        <w:rPr>
+          <w:rFonts w:hint="default" w:ascii="Arial" w:hAnsi="Arial" w:cs="Arial"/>
+          <w:b w:val="0"/>
+          <w:bCs w:val="0"/>
+          <w:sz w:val="32"/>
+          <w:szCs w:val="32"/>
+          <w:lang w:val="pt-BR"/>
+        </w:rPr>
+      </w:pPr>
+      <w:r>
+        <w:rPr>
+          <w:rFonts w:hint="default" w:ascii="Arial" w:hAnsi="Arial" w:cs="Arial"/>
+          <w:b w:val="0"/>
+          <w:bCs w:val="0"/>
+          <w:sz w:val="32"/>
+          <w:szCs w:val="32"/>
+          <w:lang w:val="pt-BR"/>
+        </w:rPr>
+        <w:t>A camada de rede carrega a responsabilidade da entrega e tráfego de dados até a máquina de destino, a camada de enlance surge para garantir essa comunicação ponto a ponto ou hop to hop, resumidamente essa comunicação por todo o tráfego de hardware que a informação fizer.</w:t>
+      </w:r>
+    </w:p>
+    <w:p>
+      <w:pPr>
+        <w:numPr>
+          <w:numId w:val="0"/>
+        </w:numPr>
+        <w:rPr>
+          <w:rFonts w:hint="default" w:ascii="Arial" w:hAnsi="Arial" w:cs="Arial"/>
+          <w:b w:val="0"/>
+          <w:bCs w:val="0"/>
+          <w:sz w:val="32"/>
+          <w:szCs w:val="32"/>
+          <w:lang w:val="pt-BR"/>
+        </w:rPr>
+      </w:pPr>
+      <w:r>
+        <w:rPr>
+          <w:rFonts w:hint="default" w:ascii="Arial" w:hAnsi="Arial" w:cs="Arial"/>
+          <w:b w:val="0"/>
+          <w:bCs w:val="0"/>
+          <w:sz w:val="32"/>
+          <w:szCs w:val="32"/>
+          <w:lang w:val="pt-BR"/>
+        </w:rPr>
+        <w:t>Fazendo pausas especificas, para ter um ponto de base para como os dados chegaram em cada local.</w:t>
+      </w:r>
+    </w:p>
+    <w:p>
+      <w:pPr>
+        <w:numPr>
+          <w:numId w:val="0"/>
+        </w:numPr>
+        <w:rPr>
+          <w:rFonts w:hint="default" w:ascii="Arial" w:hAnsi="Arial" w:cs="Arial"/>
+          <w:b w:val="0"/>
+          <w:bCs w:val="0"/>
+          <w:sz w:val="32"/>
+          <w:szCs w:val="32"/>
+          <w:lang w:val="pt-BR"/>
+        </w:rPr>
+      </w:pPr>
+      <w:r>
+        <w:rPr>
+          <w:rFonts w:hint="default" w:ascii="Arial" w:hAnsi="Arial" w:cs="Arial"/>
+          <w:b w:val="0"/>
+          <w:bCs w:val="0"/>
+          <w:sz w:val="32"/>
+          <w:szCs w:val="32"/>
+          <w:lang w:val="pt-BR"/>
+        </w:rPr>
+        <w:t>Ela é responsável por fazer a comunicação entre dispositivos adjacentes, e não só sistemas finais, conectando todos os nós possíveis.</w:t>
+      </w:r>
+    </w:p>
+    <w:p>
+      <w:pPr>
+        <w:numPr>
+          <w:numId w:val="0"/>
+        </w:numPr>
+        <w:rPr>
+          <w:rFonts w:hint="default" w:ascii="Arial" w:hAnsi="Arial" w:cs="Arial"/>
+          <w:b w:val="0"/>
+          <w:bCs w:val="0"/>
+          <w:sz w:val="32"/>
+          <w:szCs w:val="32"/>
+          <w:lang w:val="pt-BR"/>
+        </w:rPr>
+      </w:pPr>
+      <w:r>
+        <w:drawing>
+          <wp:inline distT="0" distB="0" distL="114300" distR="114300">
+            <wp:extent cx="4815840" cy="2659380"/>
+            <wp:effectExtent l="0" t="0" r="0" b="7620"/>
+            <wp:docPr id="11" name="Imagem 11"/>
+            <wp:cNvGraphicFramePr>
+              <a:graphicFrameLocks xmlns:a="http://schemas.openxmlformats.org/drawingml/2006/main" noChangeAspect="1"/>
+            </wp:cNvGraphicFramePr>
+            <a:graphic xmlns:a="http://schemas.openxmlformats.org/drawingml/2006/main">
+              <a:graphicData uri="http://schemas.openxmlformats.org/drawingml/2006/picture">
+                <pic:pic xmlns:pic="http://schemas.openxmlformats.org/drawingml/2006/picture">
+                  <pic:nvPicPr>
+                    <pic:cNvPr id="11" name="Imagem 11"/>
+                    <pic:cNvPicPr>
+                      <a:picLocks noChangeAspect="1"/>
+                    </pic:cNvPicPr>
+                  </pic:nvPicPr>
+                  <pic:blipFill>
+                    <a:blip r:embed="rId11"/>
+                    <a:stretch>
+                      <a:fillRect/>
+                    </a:stretch>
+                  </pic:blipFill>
+                  <pic:spPr>
+                    <a:xfrm>
+                      <a:off x="0" y="0"/>
+                      <a:ext cx="4815840" cy="2659380"/>
+                    </a:xfrm>
+                    <a:prstGeom prst="rect">
+                      <a:avLst/>
+                    </a:prstGeom>
+                    <a:noFill/>
+                    <a:ln>
+                      <a:noFill/>
+                    </a:ln>
+                  </pic:spPr>
+                </pic:pic>
+              </a:graphicData>
+            </a:graphic>
+          </wp:inline>
+        </w:drawing>
+      </w:r>
+    </w:p>
+    <w:p>
+      <w:pPr>
+        <w:numPr>
+          <w:numId w:val="0"/>
+        </w:numPr>
+        <w:rPr>
+          <w:rFonts w:hint="default" w:ascii="Arial" w:hAnsi="Arial" w:cs="Arial"/>
+          <w:b w:val="0"/>
+          <w:bCs w:val="0"/>
+          <w:sz w:val="32"/>
+          <w:szCs w:val="32"/>
+          <w:lang w:val="pt-BR"/>
+        </w:rPr>
+      </w:pPr>
+      <w:r>
+        <w:rPr>
+          <w:rFonts w:hint="default" w:ascii="Arial" w:hAnsi="Arial" w:cs="Arial"/>
+          <w:b w:val="0"/>
+          <w:bCs w:val="0"/>
+          <w:sz w:val="32"/>
+          <w:szCs w:val="32"/>
+          <w:lang w:val="pt-BR"/>
+        </w:rPr>
+        <w:t>Representação</w:t>
+      </w:r>
+    </w:p>
+    <w:p>
+      <w:pPr>
+        <w:numPr>
+          <w:numId w:val="0"/>
+        </w:numPr>
+        <w:rPr>
+          <w:rFonts w:hint="default" w:ascii="Arial" w:hAnsi="Arial" w:cs="Arial"/>
+          <w:b w:val="0"/>
+          <w:bCs w:val="0"/>
+          <w:sz w:val="32"/>
+          <w:szCs w:val="32"/>
+          <w:lang w:val="pt-BR"/>
+        </w:rPr>
+      </w:pPr>
+    </w:p>
+    <w:p>
+      <w:pPr>
+        <w:numPr>
+          <w:numId w:val="0"/>
+        </w:numPr>
+        <w:rPr>
+          <w:rFonts w:hint="default" w:ascii="Arial" w:hAnsi="Arial" w:cs="Arial"/>
+          <w:b w:val="0"/>
+          <w:bCs w:val="0"/>
+          <w:sz w:val="32"/>
+          <w:szCs w:val="32"/>
+          <w:lang w:val="pt-BR"/>
+        </w:rPr>
+      </w:pPr>
+      <w:r>
+        <w:rPr>
+          <w:rFonts w:hint="default" w:ascii="Arial" w:hAnsi="Arial" w:cs="Arial"/>
+          <w:b w:val="0"/>
+          <w:bCs w:val="0"/>
+          <w:sz w:val="32"/>
+          <w:szCs w:val="32"/>
+          <w:lang w:val="pt-BR"/>
+        </w:rPr>
+        <w:t>Diferença de transporte e enlance</w:t>
+      </w:r>
+    </w:p>
+    <w:p>
+      <w:pPr>
+        <w:numPr>
+          <w:numId w:val="0"/>
+        </w:numPr>
+        <w:rPr>
+          <w:rFonts w:hint="default" w:ascii="Arial" w:hAnsi="Arial" w:cs="Arial"/>
+          <w:b w:val="0"/>
+          <w:bCs w:val="0"/>
+          <w:sz w:val="32"/>
+          <w:szCs w:val="32"/>
+          <w:lang w:val="pt-BR"/>
+        </w:rPr>
+      </w:pPr>
+      <w:r>
+        <w:rPr>
+          <w:rFonts w:hint="default" w:ascii="Arial" w:hAnsi="Arial" w:cs="Arial"/>
+          <w:b w:val="0"/>
+          <w:bCs w:val="0"/>
+          <w:sz w:val="32"/>
+          <w:szCs w:val="32"/>
+          <w:lang w:val="pt-BR"/>
+        </w:rPr>
+        <w:t>Transporte:</w:t>
+      </w:r>
+    </w:p>
+    <w:p>
+      <w:pPr>
+        <w:numPr>
+          <w:numId w:val="0"/>
+        </w:numPr>
+        <w:rPr>
+          <w:rFonts w:hint="default" w:ascii="Arial" w:hAnsi="Arial" w:cs="Arial"/>
+          <w:b w:val="0"/>
+          <w:bCs w:val="0"/>
+          <w:sz w:val="32"/>
+          <w:szCs w:val="32"/>
+          <w:lang w:val="pt-BR"/>
+        </w:rPr>
+      </w:pPr>
+      <w:r>
+        <w:rPr>
+          <w:rFonts w:hint="default" w:ascii="Arial" w:hAnsi="Arial" w:cs="Arial"/>
+          <w:b w:val="0"/>
+          <w:bCs w:val="0"/>
+          <w:sz w:val="32"/>
+          <w:szCs w:val="32"/>
+          <w:lang w:val="pt-BR"/>
+        </w:rPr>
+        <w:t>Realiza entrega confiável processo a processo (dispositivo a dispositivo)</w:t>
+      </w:r>
+    </w:p>
+    <w:p>
+      <w:pPr>
+        <w:numPr>
+          <w:numId w:val="0"/>
+        </w:numPr>
+        <w:rPr>
+          <w:rFonts w:hint="default" w:ascii="Arial" w:hAnsi="Arial" w:cs="Arial"/>
+          <w:b w:val="0"/>
+          <w:bCs w:val="0"/>
+          <w:sz w:val="32"/>
+          <w:szCs w:val="32"/>
+          <w:lang w:val="pt-BR"/>
+        </w:rPr>
+      </w:pPr>
+    </w:p>
+    <w:p>
+      <w:pPr>
+        <w:numPr>
+          <w:numId w:val="0"/>
+        </w:numPr>
+        <w:rPr>
+          <w:rFonts w:hint="default" w:ascii="Arial" w:hAnsi="Arial" w:cs="Arial"/>
+          <w:b w:val="0"/>
+          <w:bCs w:val="0"/>
+          <w:sz w:val="32"/>
+          <w:szCs w:val="32"/>
+          <w:lang w:val="pt-BR"/>
+        </w:rPr>
+      </w:pPr>
+      <w:r>
+        <w:rPr>
+          <w:rFonts w:hint="default" w:ascii="Arial" w:hAnsi="Arial" w:cs="Arial"/>
+          <w:b w:val="0"/>
+          <w:bCs w:val="0"/>
+          <w:sz w:val="32"/>
+          <w:szCs w:val="32"/>
+          <w:lang w:val="pt-BR"/>
+        </w:rPr>
+        <w:t>Enlance:</w:t>
+      </w:r>
+    </w:p>
+    <w:p>
+      <w:pPr>
+        <w:numPr>
+          <w:numId w:val="0"/>
+        </w:numPr>
+        <w:rPr>
+          <w:rFonts w:hint="default" w:ascii="Arial" w:hAnsi="Arial" w:cs="Arial"/>
+          <w:b w:val="0"/>
+          <w:bCs w:val="0"/>
+          <w:sz w:val="32"/>
+          <w:szCs w:val="32"/>
+          <w:lang w:val="pt-BR"/>
+        </w:rPr>
+      </w:pPr>
+      <w:r>
+        <w:rPr>
+          <w:rFonts w:hint="default" w:ascii="Arial" w:hAnsi="Arial" w:cs="Arial"/>
+          <w:b w:val="0"/>
+          <w:bCs w:val="0"/>
+          <w:sz w:val="32"/>
+          <w:szCs w:val="32"/>
+          <w:lang w:val="pt-BR"/>
+        </w:rPr>
+        <w:t>Realiza entrega confiável entre máquinas adjacentes, nó a nó (percorrendo todo percuso).</w:t>
+      </w:r>
+    </w:p>
+    <w:p>
+      <w:pPr>
+        <w:numPr>
+          <w:numId w:val="0"/>
+        </w:numPr>
+        <w:rPr>
+          <w:rFonts w:hint="default" w:ascii="Arial" w:hAnsi="Arial" w:cs="Arial"/>
+          <w:b w:val="0"/>
+          <w:bCs w:val="0"/>
+          <w:sz w:val="32"/>
+          <w:szCs w:val="32"/>
+          <w:lang w:val="pt-BR"/>
+        </w:rPr>
+      </w:pPr>
+      <w:r>
+        <w:rPr>
+          <w:rFonts w:hint="default" w:ascii="Arial" w:hAnsi="Arial" w:cs="Arial"/>
+          <w:b w:val="0"/>
+          <w:bCs w:val="0"/>
+          <w:sz w:val="32"/>
+          <w:szCs w:val="32"/>
+          <w:lang w:val="pt-BR"/>
+        </w:rPr>
+        <w:t>Por esse motivo, o enlance tem muitas funções, seguem elas...</w:t>
+      </w:r>
+    </w:p>
+    <w:p>
+      <w:pPr>
+        <w:numPr>
+          <w:ilvl w:val="0"/>
+          <w:numId w:val="2"/>
+        </w:numPr>
+        <w:ind w:left="420" w:leftChars="0" w:hanging="420" w:firstLineChars="0"/>
+        <w:rPr>
+          <w:rFonts w:hint="default" w:ascii="Arial" w:hAnsi="Arial" w:cs="Arial"/>
+          <w:b w:val="0"/>
+          <w:bCs w:val="0"/>
+          <w:sz w:val="32"/>
+          <w:szCs w:val="32"/>
+          <w:lang w:val="pt-BR"/>
+        </w:rPr>
+      </w:pPr>
+      <w:r>
+        <w:rPr>
+          <w:rFonts w:hint="default" w:ascii="Arial" w:hAnsi="Arial" w:cs="Arial"/>
+          <w:b w:val="0"/>
+          <w:bCs w:val="0"/>
+          <w:sz w:val="32"/>
+          <w:szCs w:val="32"/>
+          <w:lang w:val="pt-BR"/>
+        </w:rPr>
+        <w:t>Controle de erros</w:t>
+      </w:r>
+    </w:p>
+    <w:p>
+      <w:pPr>
+        <w:numPr>
+          <w:ilvl w:val="1"/>
+          <w:numId w:val="2"/>
+        </w:numPr>
+        <w:ind w:left="840" w:leftChars="0" w:hanging="420" w:firstLineChars="0"/>
+        <w:rPr>
+          <w:rFonts w:hint="default" w:ascii="Arial" w:hAnsi="Arial" w:cs="Arial"/>
+          <w:b w:val="0"/>
+          <w:bCs w:val="0"/>
+          <w:sz w:val="32"/>
+          <w:szCs w:val="32"/>
+          <w:lang w:val="pt-BR"/>
+        </w:rPr>
+      </w:pPr>
+      <w:r>
+        <w:rPr>
+          <w:rFonts w:hint="default" w:ascii="Arial" w:hAnsi="Arial" w:cs="Arial"/>
+          <w:b w:val="0"/>
+          <w:bCs w:val="0"/>
+          <w:sz w:val="32"/>
+          <w:szCs w:val="32"/>
+          <w:lang w:val="pt-BR"/>
+        </w:rPr>
+        <w:t>Os meios de transmissão não são livres de erro, o enlance pode implementar mecanismos de controle de erro, com finalidade de agregar confiabilidade no processo.</w:t>
+      </w:r>
+    </w:p>
+    <w:p>
+      <w:pPr>
+        <w:numPr>
+          <w:numId w:val="0"/>
+        </w:numPr>
+        <w:ind w:left="420" w:leftChars="0"/>
+        <w:rPr>
+          <w:rFonts w:hint="default" w:ascii="Arial" w:hAnsi="Arial" w:cs="Arial"/>
+          <w:b w:val="0"/>
+          <w:bCs w:val="0"/>
+          <w:sz w:val="32"/>
+          <w:szCs w:val="32"/>
+          <w:lang w:val="pt-BR"/>
+        </w:rPr>
+      </w:pPr>
+    </w:p>
+    <w:p>
+      <w:pPr>
+        <w:numPr>
+          <w:ilvl w:val="0"/>
+          <w:numId w:val="2"/>
+        </w:numPr>
+        <w:ind w:left="420" w:leftChars="0" w:hanging="420" w:firstLineChars="0"/>
+        <w:rPr>
+          <w:rFonts w:hint="default" w:ascii="Arial" w:hAnsi="Arial" w:cs="Arial"/>
+          <w:b w:val="0"/>
+          <w:bCs w:val="0"/>
+          <w:sz w:val="32"/>
+          <w:szCs w:val="32"/>
+          <w:lang w:val="pt-BR"/>
+        </w:rPr>
+      </w:pPr>
+      <w:r>
+        <w:rPr>
+          <w:rFonts w:hint="default" w:ascii="Arial" w:hAnsi="Arial" w:cs="Arial"/>
+          <w:b w:val="0"/>
+          <w:bCs w:val="0"/>
+          <w:sz w:val="32"/>
+          <w:szCs w:val="32"/>
+          <w:lang w:val="pt-BR"/>
+        </w:rPr>
+        <w:t>Controle de acesso ao meio</w:t>
+      </w:r>
+    </w:p>
+    <w:p>
+      <w:pPr>
+        <w:numPr>
+          <w:ilvl w:val="1"/>
+          <w:numId w:val="2"/>
+        </w:numPr>
+        <w:ind w:left="840" w:leftChars="0" w:hanging="420" w:firstLineChars="0"/>
+        <w:rPr>
+          <w:rFonts w:hint="default" w:ascii="Arial" w:hAnsi="Arial" w:cs="Arial"/>
+          <w:b w:val="0"/>
+          <w:bCs w:val="0"/>
+          <w:sz w:val="32"/>
+          <w:szCs w:val="32"/>
+          <w:lang w:val="pt-BR"/>
+        </w:rPr>
+      </w:pPr>
+      <w:r>
+        <w:rPr>
+          <w:rFonts w:hint="default" w:ascii="Arial" w:hAnsi="Arial" w:cs="Arial"/>
+          <w:b w:val="0"/>
+          <w:bCs w:val="0"/>
+          <w:sz w:val="32"/>
+          <w:szCs w:val="32"/>
+          <w:lang w:val="pt-BR"/>
+        </w:rPr>
+        <w:t>Se da por conta de alguns meios de transmissão serem compartilhados por múltiplos dispositivos, e é necessário filtrar qual dos dispositivos pode transmitir naquele momento.</w:t>
+      </w:r>
+    </w:p>
+    <w:p>
+      <w:pPr>
+        <w:numPr>
+          <w:ilvl w:val="0"/>
+          <w:numId w:val="2"/>
+        </w:numPr>
+        <w:ind w:left="420" w:leftChars="0" w:hanging="420" w:firstLineChars="0"/>
+        <w:rPr>
+          <w:rFonts w:hint="default" w:ascii="Arial" w:hAnsi="Arial" w:cs="Arial"/>
+          <w:b w:val="0"/>
+          <w:bCs w:val="0"/>
+          <w:sz w:val="32"/>
+          <w:szCs w:val="32"/>
+          <w:lang w:val="pt-BR"/>
+        </w:rPr>
+      </w:pPr>
+      <w:r>
+        <w:rPr>
+          <w:rFonts w:hint="default" w:ascii="Arial" w:hAnsi="Arial" w:cs="Arial"/>
+          <w:b w:val="0"/>
+          <w:bCs w:val="0"/>
+          <w:sz w:val="32"/>
+          <w:szCs w:val="32"/>
+          <w:lang w:val="pt-BR"/>
+        </w:rPr>
+        <w:t>Endereçamento físico</w:t>
+      </w:r>
+    </w:p>
+    <w:p>
+      <w:pPr>
+        <w:numPr>
+          <w:ilvl w:val="1"/>
+          <w:numId w:val="2"/>
+        </w:numPr>
+        <w:ind w:left="840" w:leftChars="0" w:hanging="420" w:firstLineChars="0"/>
+        <w:rPr>
+          <w:rFonts w:hint="default" w:ascii="Arial" w:hAnsi="Arial" w:cs="Arial"/>
+          <w:b w:val="0"/>
+          <w:bCs w:val="0"/>
+          <w:sz w:val="32"/>
+          <w:szCs w:val="32"/>
+          <w:lang w:val="pt-BR"/>
+        </w:rPr>
+      </w:pPr>
+      <w:r>
+        <w:rPr>
+          <w:rFonts w:hint="default" w:ascii="Arial" w:hAnsi="Arial" w:cs="Arial"/>
+          <w:b w:val="0"/>
+          <w:bCs w:val="0"/>
+          <w:sz w:val="32"/>
+          <w:szCs w:val="32"/>
+          <w:lang w:val="pt-BR"/>
+        </w:rPr>
+        <w:t>Endereço fisico (MAC) diz para qual dispositivo o quadro deve ser endregue agora, naquele trecho da rede.</w:t>
+      </w:r>
+    </w:p>
+    <w:p>
+      <w:pPr>
+        <w:numPr>
+          <w:ilvl w:val="1"/>
+          <w:numId w:val="2"/>
+        </w:numPr>
+        <w:ind w:left="840" w:leftChars="0" w:hanging="420" w:firstLineChars="0"/>
+        <w:rPr>
+          <w:rFonts w:hint="default" w:ascii="Arial" w:hAnsi="Arial" w:cs="Arial"/>
+          <w:b w:val="0"/>
+          <w:bCs w:val="0"/>
+          <w:sz w:val="32"/>
+          <w:szCs w:val="32"/>
+          <w:lang w:val="pt-BR"/>
+        </w:rPr>
+      </w:pPr>
+      <w:r>
+        <w:rPr>
+          <w:rFonts w:hint="default" w:ascii="Arial" w:hAnsi="Arial" w:cs="Arial"/>
+          <w:b w:val="0"/>
+          <w:bCs w:val="0"/>
+          <w:sz w:val="32"/>
+          <w:szCs w:val="32"/>
+          <w:lang w:val="pt-BR"/>
+        </w:rPr>
+        <w:t>Temos outros dois tipos de endereço seguem abaixo</w:t>
+      </w:r>
+    </w:p>
+    <w:p>
+      <w:pPr>
+        <w:numPr>
+          <w:numId w:val="0"/>
+        </w:numPr>
+        <w:ind w:left="900" w:leftChars="175" w:hanging="480" w:hangingChars="150"/>
+        <w:rPr>
+          <w:rFonts w:hint="default" w:ascii="Arial" w:hAnsi="Arial" w:cs="Arial"/>
+          <w:b w:val="0"/>
+          <w:bCs w:val="0"/>
+          <w:sz w:val="32"/>
+          <w:szCs w:val="32"/>
+          <w:lang w:val="pt-BR"/>
+        </w:rPr>
+      </w:pPr>
+      <w:r>
+        <w:rPr>
+          <w:rFonts w:hint="default" w:ascii="Arial" w:hAnsi="Arial" w:cs="Arial"/>
+          <w:b w:val="0"/>
+          <w:bCs w:val="0"/>
+          <w:sz w:val="32"/>
+          <w:szCs w:val="32"/>
+          <w:lang w:val="pt-BR"/>
+        </w:rPr>
+        <w:t xml:space="preserve">     O endereço lógico (IP) diz qual dispositivo é o destino final.</w:t>
+      </w:r>
+    </w:p>
+    <w:p>
+      <w:pPr>
+        <w:numPr>
+          <w:numId w:val="0"/>
+        </w:numPr>
+        <w:ind w:left="900" w:leftChars="175" w:hanging="480" w:hangingChars="150"/>
+        <w:rPr>
+          <w:rFonts w:hint="default" w:ascii="Arial" w:hAnsi="Arial" w:cs="Arial"/>
+          <w:b w:val="0"/>
+          <w:bCs w:val="0"/>
+          <w:sz w:val="32"/>
+          <w:szCs w:val="32"/>
+          <w:lang w:val="pt-BR"/>
+        </w:rPr>
+      </w:pPr>
+      <w:r>
+        <w:rPr>
+          <w:rFonts w:hint="default" w:ascii="Arial" w:hAnsi="Arial" w:cs="Arial"/>
+          <w:b w:val="0"/>
+          <w:bCs w:val="0"/>
+          <w:sz w:val="32"/>
+          <w:szCs w:val="32"/>
+          <w:lang w:val="pt-BR"/>
+        </w:rPr>
+        <w:t xml:space="preserve">      Ex: 172.16.0.10</w:t>
+      </w:r>
+    </w:p>
+    <w:p>
+      <w:pPr>
+        <w:numPr>
+          <w:ilvl w:val="0"/>
+          <w:numId w:val="0"/>
+        </w:numPr>
+        <w:ind w:left="1278" w:leftChars="399" w:hanging="320" w:hangingChars="100"/>
+        <w:rPr>
+          <w:rFonts w:hint="default" w:ascii="Arial" w:hAnsi="Arial" w:cs="Arial"/>
+          <w:b w:val="0"/>
+          <w:bCs w:val="0"/>
+          <w:sz w:val="32"/>
+          <w:szCs w:val="32"/>
+          <w:lang w:val="pt-BR"/>
+        </w:rPr>
+      </w:pPr>
+      <w:r>
+        <w:rPr>
+          <w:rFonts w:hint="default" w:ascii="Arial" w:hAnsi="Arial" w:cs="Arial"/>
+          <w:b w:val="0"/>
+          <w:bCs w:val="0"/>
+          <w:sz w:val="32"/>
+          <w:szCs w:val="32"/>
+          <w:lang w:val="pt-BR"/>
+        </w:rPr>
+        <w:t>O endereço de porta diz qual processo/programa</w:t>
+      </w:r>
+    </w:p>
+    <w:p>
+      <w:pPr>
+        <w:numPr>
+          <w:ilvl w:val="0"/>
+          <w:numId w:val="0"/>
+        </w:numPr>
+        <w:ind w:left="1278" w:leftChars="399" w:hanging="320" w:hangingChars="100"/>
+        <w:rPr>
+          <w:rFonts w:hint="default" w:ascii="Arial" w:hAnsi="Arial" w:cs="Arial"/>
+          <w:b w:val="0"/>
+          <w:bCs w:val="0"/>
+          <w:sz w:val="32"/>
+          <w:szCs w:val="32"/>
+          <w:lang w:val="pt-BR"/>
+        </w:rPr>
+      </w:pPr>
+      <w:r>
+        <w:rPr>
+          <w:rFonts w:hint="default" w:ascii="Arial" w:hAnsi="Arial" w:cs="Arial"/>
+          <w:b w:val="0"/>
+          <w:bCs w:val="0"/>
+          <w:sz w:val="32"/>
+          <w:szCs w:val="32"/>
+          <w:lang w:val="pt-BR"/>
+        </w:rPr>
+        <w:t>deve receber os dados</w:t>
+      </w:r>
+    </w:p>
+    <w:p>
+      <w:pPr>
+        <w:numPr>
+          <w:ilvl w:val="0"/>
+          <w:numId w:val="0"/>
+        </w:numPr>
+        <w:ind w:left="1278" w:leftChars="399" w:hanging="320" w:hangingChars="100"/>
+        <w:rPr>
+          <w:rFonts w:hint="default" w:ascii="Arial" w:hAnsi="Arial" w:cs="Arial"/>
+          <w:b w:val="0"/>
+          <w:bCs w:val="0"/>
+          <w:sz w:val="32"/>
+          <w:szCs w:val="32"/>
+          <w:lang w:val="pt-BR"/>
+        </w:rPr>
+      </w:pPr>
+      <w:r>
+        <w:rPr>
+          <w:rFonts w:hint="default" w:ascii="Arial" w:hAnsi="Arial" w:cs="Arial"/>
+          <w:b w:val="0"/>
+          <w:bCs w:val="0"/>
+          <w:sz w:val="32"/>
+          <w:szCs w:val="32"/>
+          <w:lang w:val="pt-BR"/>
+        </w:rPr>
+        <w:t>Ex: porta 443 (serviço https)</w:t>
+      </w:r>
+    </w:p>
+    <w:p>
+      <w:pPr>
+        <w:numPr>
+          <w:ilvl w:val="0"/>
+          <w:numId w:val="3"/>
+        </w:numPr>
+        <w:ind w:left="420" w:leftChars="0" w:hanging="420" w:firstLineChars="0"/>
+        <w:rPr>
+          <w:rFonts w:hint="default" w:ascii="Arial" w:hAnsi="Arial" w:cs="Arial"/>
+          <w:b w:val="0"/>
+          <w:bCs w:val="0"/>
+          <w:sz w:val="32"/>
+          <w:szCs w:val="32"/>
+          <w:lang w:val="pt-BR"/>
+        </w:rPr>
+      </w:pPr>
+      <w:r>
+        <w:rPr>
+          <w:rFonts w:hint="default" w:ascii="Arial" w:hAnsi="Arial" w:cs="Arial"/>
+          <w:b w:val="0"/>
+          <w:bCs w:val="0"/>
+          <w:sz w:val="32"/>
+          <w:szCs w:val="32"/>
+          <w:lang w:val="pt-BR"/>
+        </w:rPr>
+        <w:t>Controle de fluxo</w:t>
+      </w:r>
+    </w:p>
+    <w:p>
+      <w:pPr>
+        <w:numPr>
+          <w:ilvl w:val="1"/>
+          <w:numId w:val="3"/>
+        </w:numPr>
+        <w:ind w:left="840" w:leftChars="0" w:hanging="420" w:firstLineChars="0"/>
+        <w:rPr>
+          <w:rFonts w:hint="default" w:ascii="Arial" w:hAnsi="Arial" w:cs="Arial"/>
+          <w:b w:val="0"/>
+          <w:bCs w:val="0"/>
+          <w:sz w:val="32"/>
+          <w:szCs w:val="32"/>
+          <w:lang w:val="pt-BR"/>
+        </w:rPr>
+      </w:pPr>
+      <w:r>
+        <w:rPr>
+          <w:rFonts w:hint="default" w:ascii="Arial" w:hAnsi="Arial" w:cs="Arial"/>
+          <w:b w:val="0"/>
+          <w:bCs w:val="0"/>
+          <w:sz w:val="32"/>
+          <w:szCs w:val="32"/>
+          <w:lang w:val="pt-BR"/>
+        </w:rPr>
+        <w:t>Evita que o nó de origem sobrecarregue o nó de destino.</w:t>
+      </w:r>
+    </w:p>
+    <w:p>
+      <w:pPr>
+        <w:numPr>
+          <w:ilvl w:val="0"/>
+          <w:numId w:val="3"/>
+        </w:numPr>
+        <w:ind w:left="420" w:leftChars="0" w:hanging="420" w:firstLineChars="0"/>
+        <w:rPr>
+          <w:rFonts w:hint="default" w:ascii="Arial" w:hAnsi="Arial" w:cs="Arial"/>
+          <w:b w:val="0"/>
+          <w:bCs w:val="0"/>
+          <w:sz w:val="32"/>
+          <w:szCs w:val="32"/>
+          <w:lang w:val="pt-BR"/>
+        </w:rPr>
+      </w:pPr>
+      <w:r>
+        <w:rPr>
+          <w:rFonts w:hint="default" w:ascii="Arial" w:hAnsi="Arial" w:cs="Arial"/>
+          <w:b w:val="0"/>
+          <w:bCs w:val="0"/>
+          <w:sz w:val="32"/>
+          <w:szCs w:val="32"/>
+          <w:lang w:val="pt-BR"/>
+        </w:rPr>
+        <w:t xml:space="preserve">  Enquadramento</w:t>
+      </w:r>
+    </w:p>
+    <w:p>
+      <w:pPr>
+        <w:numPr>
+          <w:ilvl w:val="1"/>
+          <w:numId w:val="3"/>
+        </w:numPr>
+        <w:ind w:left="840" w:leftChars="0" w:hanging="420" w:firstLineChars="0"/>
+        <w:rPr>
+          <w:rFonts w:hint="default" w:ascii="Arial" w:hAnsi="Arial" w:cs="Arial"/>
+          <w:b w:val="0"/>
+          <w:bCs w:val="0"/>
+          <w:sz w:val="32"/>
+          <w:szCs w:val="32"/>
+          <w:lang w:val="pt-BR"/>
+        </w:rPr>
+      </w:pPr>
+      <w:r>
+        <w:rPr>
+          <w:rFonts w:hint="default" w:ascii="Arial" w:hAnsi="Arial" w:cs="Arial"/>
+          <w:b w:val="0"/>
+          <w:bCs w:val="0"/>
+          <w:sz w:val="32"/>
+          <w:szCs w:val="32"/>
+          <w:lang w:val="pt-BR"/>
+        </w:rPr>
+        <w:t>A camada de enlance recebe o (PDU) da camada de rede, encapsulando-os em quadros (PDU) da camada de enlance tendo a função de adicionar os delimitadores de inicio e fim do quadro, para permitir que o nó vizinho possa ver o fluxo de bits e definir onde inicia e termina o quadro.</w:t>
+      </w:r>
+    </w:p>
+    <w:p>
+      <w:pPr>
+        <w:numPr>
+          <w:numId w:val="0"/>
+        </w:numPr>
+        <w:rPr>
+          <w:rFonts w:hint="default" w:ascii="Arial" w:hAnsi="Arial" w:cs="Arial"/>
+          <w:b/>
+          <w:bCs/>
+          <w:sz w:val="32"/>
+          <w:szCs w:val="32"/>
+          <w:lang w:val="pt-BR"/>
+        </w:rPr>
+      </w:pPr>
+      <w:r>
+        <w:rPr>
+          <w:rFonts w:hint="default" w:ascii="Arial" w:hAnsi="Arial" w:cs="Arial"/>
+          <w:b/>
+          <w:bCs/>
+          <w:sz w:val="32"/>
+          <w:szCs w:val="32"/>
+          <w:lang w:val="pt-BR"/>
+        </w:rPr>
+        <w:t>Fisica</w:t>
+      </w:r>
+    </w:p>
+    <w:p>
+      <w:pPr>
+        <w:numPr>
+          <w:numId w:val="0"/>
+        </w:numPr>
+        <w:rPr>
+          <w:rFonts w:hint="default" w:ascii="Arial" w:hAnsi="Arial" w:cs="Arial"/>
+          <w:b w:val="0"/>
+          <w:bCs w:val="0"/>
+          <w:sz w:val="32"/>
+          <w:szCs w:val="32"/>
+          <w:lang w:val="pt-BR"/>
+        </w:rPr>
+      </w:pPr>
+      <w:r>
+        <w:rPr>
+          <w:rFonts w:hint="default" w:ascii="Arial" w:hAnsi="Arial" w:cs="Arial"/>
+          <w:b w:val="0"/>
+          <w:bCs w:val="0"/>
+          <w:sz w:val="32"/>
+          <w:szCs w:val="32"/>
+          <w:lang w:val="pt-BR"/>
+        </w:rPr>
+        <w:t>Camda responsável por pegar os quadros da camada de enlance, transformar em bits, e transportar pelo meio de transmissão.</w:t>
+      </w:r>
+    </w:p>
+    <w:p>
+      <w:pPr>
+        <w:numPr>
+          <w:numId w:val="0"/>
+        </w:numPr>
+        <w:rPr>
+          <w:rFonts w:hint="default" w:ascii="Arial" w:hAnsi="Arial" w:cs="Arial"/>
+          <w:b w:val="0"/>
+          <w:bCs w:val="0"/>
+          <w:sz w:val="32"/>
+          <w:szCs w:val="32"/>
+          <w:lang w:val="pt-BR"/>
+        </w:rPr>
+      </w:pPr>
+      <w:r>
+        <w:rPr>
+          <w:rFonts w:hint="default" w:ascii="Arial" w:hAnsi="Arial" w:cs="Arial"/>
+          <w:b w:val="0"/>
+          <w:bCs w:val="0"/>
+          <w:sz w:val="32"/>
+          <w:szCs w:val="32"/>
+          <w:lang w:val="pt-BR"/>
+        </w:rPr>
+        <w:t>A camada será responsável por representar os bits, ela define a representação de acordo com meio de transmissão (pulso de luz em caso de fibra ótica) ou (pulsos elétricos no caso de cabos de par trançado) e além disso ela é responsável por</w:t>
+      </w:r>
+    </w:p>
+    <w:p>
+      <w:pPr>
+        <w:numPr>
+          <w:ilvl w:val="0"/>
+          <w:numId w:val="4"/>
+        </w:numPr>
+        <w:ind w:left="420" w:leftChars="0" w:hanging="420" w:firstLineChars="0"/>
+        <w:rPr>
+          <w:rFonts w:hint="default" w:ascii="Arial" w:hAnsi="Arial" w:cs="Arial"/>
+          <w:b w:val="0"/>
+          <w:bCs w:val="0"/>
+          <w:sz w:val="32"/>
+          <w:szCs w:val="32"/>
+          <w:lang w:val="pt-BR"/>
+        </w:rPr>
+      </w:pPr>
+      <w:r>
+        <w:rPr>
+          <w:rFonts w:hint="default" w:ascii="Arial" w:hAnsi="Arial" w:cs="Arial"/>
+          <w:b w:val="0"/>
+          <w:bCs w:val="0"/>
+          <w:sz w:val="32"/>
+          <w:szCs w:val="32"/>
+          <w:lang w:val="pt-BR"/>
+        </w:rPr>
+        <w:t>Taxa de dados</w:t>
+      </w:r>
+    </w:p>
+    <w:p>
+      <w:pPr>
+        <w:numPr>
+          <w:ilvl w:val="1"/>
+          <w:numId w:val="4"/>
+        </w:numPr>
+        <w:ind w:left="840" w:leftChars="0" w:hanging="420" w:firstLineChars="0"/>
+        <w:rPr>
+          <w:rFonts w:hint="default" w:ascii="Arial" w:hAnsi="Arial" w:cs="Arial"/>
+          <w:b w:val="0"/>
+          <w:bCs w:val="0"/>
+          <w:sz w:val="32"/>
+          <w:szCs w:val="32"/>
+          <w:lang w:val="pt-BR"/>
+        </w:rPr>
+      </w:pPr>
+      <w:r>
+        <w:rPr>
+          <w:rFonts w:hint="default" w:ascii="Arial" w:hAnsi="Arial" w:cs="Arial"/>
+          <w:b w:val="0"/>
+          <w:bCs w:val="0"/>
+          <w:sz w:val="32"/>
+          <w:szCs w:val="32"/>
+          <w:lang w:val="pt-BR"/>
+        </w:rPr>
+        <w:t>A velocidade dos bits são responsabilidade da camada fisica, a expressão megabits por segundo (Mbps), que define a taxa de transmissão de determinado enlance. Quanto maior a taxa, menor a duração do bit, e vice-versa.</w:t>
+      </w:r>
+    </w:p>
+    <w:p>
+      <w:pPr>
+        <w:numPr>
+          <w:ilvl w:val="0"/>
+          <w:numId w:val="4"/>
+        </w:numPr>
+        <w:ind w:left="420" w:leftChars="0" w:hanging="420" w:firstLineChars="0"/>
+        <w:rPr>
+          <w:rFonts w:hint="default" w:ascii="Arial" w:hAnsi="Arial" w:cs="Arial"/>
+          <w:b w:val="0"/>
+          <w:bCs w:val="0"/>
+          <w:sz w:val="32"/>
+          <w:szCs w:val="32"/>
+          <w:lang w:val="pt-BR"/>
+        </w:rPr>
+      </w:pPr>
+      <w:r>
+        <w:rPr>
+          <w:rFonts w:hint="default" w:ascii="Arial" w:hAnsi="Arial" w:cs="Arial"/>
+          <w:b w:val="0"/>
+          <w:bCs w:val="0"/>
+          <w:sz w:val="32"/>
+          <w:szCs w:val="32"/>
+          <w:lang w:val="pt-BR"/>
+        </w:rPr>
+        <w:t>Sincronização dos bits</w:t>
+      </w:r>
+    </w:p>
+    <w:p>
+      <w:pPr>
+        <w:numPr>
+          <w:ilvl w:val="1"/>
+          <w:numId w:val="4"/>
+        </w:numPr>
+        <w:ind w:left="840" w:leftChars="0" w:hanging="420" w:firstLineChars="0"/>
+        <w:rPr>
+          <w:rFonts w:hint="default" w:ascii="Arial" w:hAnsi="Arial" w:cs="Arial"/>
+          <w:b w:val="0"/>
+          <w:bCs w:val="0"/>
+          <w:sz w:val="32"/>
+          <w:szCs w:val="32"/>
+          <w:lang w:val="pt-BR"/>
+        </w:rPr>
+      </w:pPr>
+      <w:r>
+        <w:rPr>
+          <w:rFonts w:hint="default" w:ascii="Arial" w:hAnsi="Arial" w:cs="Arial"/>
+          <w:b w:val="0"/>
+          <w:bCs w:val="0"/>
+          <w:sz w:val="32"/>
+          <w:szCs w:val="32"/>
+          <w:lang w:val="pt-BR"/>
+        </w:rPr>
+        <w:t>O nó transmissor e o receptor devem ocupar a mesma taxa de bits (velocidade), entretanto os relógios (clocks) das camadas fisicas tem pequenas diferenças, ocasionando possiveis falahas de sincronismos, fica por responsabilidade da camada fisica, implementar mecanismos para permitir o sincronismo correto entre origem e destino.</w:t>
+      </w:r>
+    </w:p>
+    <w:p>
+      <w:pPr>
+        <w:numPr>
+          <w:ilvl w:val="0"/>
+          <w:numId w:val="4"/>
+        </w:numPr>
+        <w:ind w:left="420" w:leftChars="0" w:hanging="420" w:firstLineChars="0"/>
+        <w:rPr>
+          <w:rFonts w:hint="default" w:ascii="Arial" w:hAnsi="Arial" w:cs="Arial"/>
+          <w:b w:val="0"/>
+          <w:bCs w:val="0"/>
+          <w:sz w:val="32"/>
+          <w:szCs w:val="32"/>
+          <w:lang w:val="pt-BR"/>
+        </w:rPr>
+      </w:pPr>
+      <w:r>
+        <w:rPr>
+          <w:rFonts w:hint="default" w:ascii="Arial" w:hAnsi="Arial" w:cs="Arial"/>
+          <w:b w:val="0"/>
+          <w:bCs w:val="0"/>
+          <w:sz w:val="32"/>
+          <w:szCs w:val="32"/>
+          <w:lang w:val="pt-BR"/>
+        </w:rPr>
+        <w:t xml:space="preserve">Topologia fisica </w:t>
+      </w:r>
+    </w:p>
+    <w:p>
+      <w:pPr>
+        <w:numPr>
+          <w:ilvl w:val="1"/>
+          <w:numId w:val="4"/>
+        </w:numPr>
+        <w:ind w:left="840" w:leftChars="0" w:hanging="420" w:firstLineChars="0"/>
+        <w:rPr>
+          <w:rFonts w:hint="default" w:ascii="Arial" w:hAnsi="Arial" w:cs="Arial"/>
+          <w:b w:val="0"/>
+          <w:bCs w:val="0"/>
+          <w:sz w:val="32"/>
+          <w:szCs w:val="32"/>
+          <w:lang w:val="pt-BR"/>
+        </w:rPr>
+      </w:pPr>
+      <w:r>
+        <w:rPr>
+          <w:rFonts w:hint="default" w:ascii="Arial" w:hAnsi="Arial" w:cs="Arial"/>
+          <w:b w:val="0"/>
+          <w:bCs w:val="0"/>
+          <w:sz w:val="32"/>
+          <w:szCs w:val="32"/>
+          <w:lang w:val="pt-BR"/>
+        </w:rPr>
+        <w:t>Define como os nós da rede estão interligados, tendo duas formas de interligamento (ponto a ponto, conexão direta entre dois nós) e (ponto-multiponto, enlance compartilhado por diversos pontos, conexão de multiplos pontos).</w:t>
+      </w:r>
+    </w:p>
+    <w:p>
+      <w:pPr>
+        <w:numPr>
+          <w:ilvl w:val="0"/>
+          <w:numId w:val="4"/>
+        </w:numPr>
+        <w:ind w:left="420" w:leftChars="0" w:hanging="420" w:firstLineChars="0"/>
+        <w:rPr>
+          <w:rFonts w:hint="default" w:ascii="Arial" w:hAnsi="Arial" w:cs="Arial"/>
+          <w:b w:val="0"/>
+          <w:bCs w:val="0"/>
+          <w:sz w:val="32"/>
+          <w:szCs w:val="32"/>
+          <w:lang w:val="pt-BR"/>
+        </w:rPr>
+      </w:pPr>
+      <w:r>
+        <w:rPr>
+          <w:rFonts w:hint="default" w:ascii="Arial" w:hAnsi="Arial" w:cs="Arial"/>
+          <w:b w:val="0"/>
+          <w:bCs w:val="0"/>
+          <w:sz w:val="32"/>
+          <w:szCs w:val="32"/>
+          <w:lang w:val="pt-BR"/>
+        </w:rPr>
+        <w:t>Modo de transmissão</w:t>
+      </w:r>
+    </w:p>
+    <w:p>
+      <w:pPr>
+        <w:numPr>
+          <w:numId w:val="0"/>
+        </w:numPr>
+        <w:ind w:left="420" w:leftChars="0"/>
+        <w:rPr>
+          <w:rFonts w:hint="default" w:ascii="Arial" w:hAnsi="Arial" w:cs="Arial"/>
+          <w:b w:val="0"/>
+          <w:bCs w:val="0"/>
+          <w:sz w:val="32"/>
+          <w:szCs w:val="32"/>
+          <w:lang w:val="pt-BR"/>
+        </w:rPr>
+      </w:pPr>
+      <w:r>
+        <w:rPr>
+          <w:rFonts w:hint="default" w:ascii="Arial" w:hAnsi="Arial" w:cs="Arial"/>
+          <w:b w:val="0"/>
+          <w:bCs w:val="0"/>
+          <w:sz w:val="32"/>
+          <w:szCs w:val="32"/>
+          <w:lang w:val="pt-BR"/>
+        </w:rPr>
+        <w:t>Dentro do modo de transmissão existem três tipos sendo eles:</w:t>
+      </w:r>
+    </w:p>
+    <w:p>
+      <w:pPr>
+        <w:numPr>
+          <w:ilvl w:val="1"/>
+          <w:numId w:val="4"/>
+        </w:numPr>
+        <w:ind w:left="840" w:leftChars="0" w:hanging="420" w:firstLineChars="0"/>
+        <w:rPr>
+          <w:rFonts w:hint="default" w:ascii="Arial" w:hAnsi="Arial" w:cs="Arial"/>
+          <w:b w:val="0"/>
+          <w:bCs w:val="0"/>
+          <w:sz w:val="32"/>
+          <w:szCs w:val="32"/>
+          <w:lang w:val="pt-BR"/>
+        </w:rPr>
+      </w:pPr>
+      <w:r>
+        <w:rPr>
+          <w:rFonts w:hint="default" w:ascii="Arial" w:hAnsi="Arial" w:cs="Arial"/>
+          <w:b w:val="0"/>
+          <w:bCs w:val="0"/>
+          <w:sz w:val="32"/>
+          <w:szCs w:val="32"/>
+          <w:lang w:val="pt-BR"/>
+        </w:rPr>
+        <w:t>Simplex, neste modo só pode ser enviado dados em um sentido, do A pro B, ou do B pro A.</w:t>
+      </w:r>
+    </w:p>
+    <w:p>
+      <w:pPr>
+        <w:numPr>
+          <w:ilvl w:val="1"/>
+          <w:numId w:val="4"/>
+        </w:numPr>
+        <w:ind w:left="840" w:leftChars="0" w:hanging="420" w:firstLineChars="0"/>
+        <w:rPr>
+          <w:rFonts w:hint="default" w:ascii="Arial" w:hAnsi="Arial" w:cs="Arial"/>
+          <w:b w:val="0"/>
+          <w:bCs w:val="0"/>
+          <w:sz w:val="32"/>
+          <w:szCs w:val="32"/>
+          <w:lang w:val="pt-BR"/>
+        </w:rPr>
+      </w:pPr>
+      <w:r>
+        <w:rPr>
+          <w:rFonts w:hint="default" w:ascii="Arial" w:hAnsi="Arial" w:cs="Arial"/>
+          <w:b w:val="0"/>
+          <w:bCs w:val="0"/>
+          <w:sz w:val="32"/>
+          <w:szCs w:val="32"/>
+          <w:lang w:val="pt-BR"/>
+        </w:rPr>
+        <w:t>Half Duplex, neste modo pode ser enviados dados de ambos sentidos, mas não simultaneamente.</w:t>
+      </w:r>
+    </w:p>
+    <w:p>
+      <w:pPr>
+        <w:numPr>
+          <w:ilvl w:val="1"/>
+          <w:numId w:val="4"/>
+        </w:numPr>
+        <w:ind w:left="840" w:leftChars="0" w:hanging="420" w:firstLineChars="0"/>
+        <w:rPr>
+          <w:rFonts w:hint="default" w:ascii="Arial" w:hAnsi="Arial" w:cs="Arial"/>
+          <w:b w:val="0"/>
+          <w:bCs w:val="0"/>
+          <w:sz w:val="32"/>
+          <w:szCs w:val="32"/>
+          <w:lang w:val="pt-BR"/>
+        </w:rPr>
+      </w:pPr>
+      <w:r>
+        <w:rPr>
+          <w:rFonts w:hint="default" w:ascii="Arial" w:hAnsi="Arial" w:cs="Arial"/>
+          <w:b w:val="0"/>
+          <w:bCs w:val="0"/>
+          <w:sz w:val="32"/>
+          <w:szCs w:val="32"/>
+          <w:lang w:val="pt-BR"/>
+        </w:rPr>
+        <w:t>Full Duplex, neste modo pode ser enviados dados de ambos sentidos e simultaneamente.</w:t>
+      </w:r>
+    </w:p>
+    <w:p>
+      <w:pPr>
+        <w:numPr>
+          <w:numId w:val="0"/>
+        </w:numPr>
+        <w:rPr>
+          <w:rFonts w:hint="default" w:ascii="Arial" w:hAnsi="Arial" w:cs="Arial"/>
+          <w:b w:val="0"/>
+          <w:bCs w:val="0"/>
+          <w:sz w:val="32"/>
+          <w:szCs w:val="32"/>
+          <w:lang w:val="pt-BR"/>
+        </w:rPr>
+      </w:pPr>
+      <w:r>
+        <w:rPr>
+          <w:rFonts w:hint="default" w:ascii="Arial" w:hAnsi="Arial" w:cs="Arial"/>
+          <w:b w:val="0"/>
+          <w:bCs w:val="0"/>
+          <w:sz w:val="32"/>
+          <w:szCs w:val="32"/>
+          <w:lang w:val="pt-BR"/>
+        </w:rPr>
+        <w:t>Agora vamos relembrar todo o conhecimento de como é percorrido o caminho da origem até o destino passando por todas camadas de redes</w:t>
+      </w:r>
+    </w:p>
+    <w:p>
+      <w:pPr>
+        <w:numPr>
+          <w:numId w:val="0"/>
+        </w:numPr>
+        <w:rPr>
+          <w:rFonts w:hint="default" w:ascii="Arial" w:hAnsi="Arial" w:cs="Arial"/>
+          <w:b w:val="0"/>
+          <w:bCs w:val="0"/>
+          <w:sz w:val="32"/>
+          <w:szCs w:val="32"/>
+          <w:lang w:val="pt-BR"/>
+        </w:rPr>
+      </w:pPr>
+      <w:r>
+        <w:drawing>
+          <wp:inline distT="0" distB="0" distL="114300" distR="114300">
+            <wp:extent cx="5273675" cy="2630170"/>
+            <wp:effectExtent l="0" t="0" r="14605" b="6350"/>
+            <wp:docPr id="12" name="Imagem 12"/>
+            <wp:cNvGraphicFramePr>
+              <a:graphicFrameLocks xmlns:a="http://schemas.openxmlformats.org/drawingml/2006/main" noChangeAspect="1"/>
+            </wp:cNvGraphicFramePr>
+            <a:graphic xmlns:a="http://schemas.openxmlformats.org/drawingml/2006/main">
+              <a:graphicData uri="http://schemas.openxmlformats.org/drawingml/2006/picture">
+                <pic:pic xmlns:pic="http://schemas.openxmlformats.org/drawingml/2006/picture">
+                  <pic:nvPicPr>
+                    <pic:cNvPr id="12" name="Imagem 12"/>
+                    <pic:cNvPicPr>
+                      <a:picLocks noChangeAspect="1"/>
+                    </pic:cNvPicPr>
+                  </pic:nvPicPr>
+                  <pic:blipFill>
+                    <a:blip r:embed="rId12"/>
+                    <a:stretch>
+                      <a:fillRect/>
+                    </a:stretch>
+                  </pic:blipFill>
+                  <pic:spPr>
+                    <a:xfrm>
+                      <a:off x="0" y="0"/>
+                      <a:ext cx="5273675" cy="2630170"/>
+                    </a:xfrm>
+                    <a:prstGeom prst="rect">
+                      <a:avLst/>
+                    </a:prstGeom>
+                    <a:noFill/>
+                    <a:ln>
+                      <a:noFill/>
+                    </a:ln>
+                  </pic:spPr>
+                </pic:pic>
+              </a:graphicData>
+            </a:graphic>
+          </wp:inline>
+        </w:drawing>
+      </w:r>
+    </w:p>
+    <w:p>
+      <w:pPr>
+        <w:numPr>
+          <w:numId w:val="0"/>
+        </w:numPr>
+        <w:ind w:left="900" w:leftChars="175" w:hanging="480" w:hangingChars="150"/>
+        <w:rPr>
+          <w:rFonts w:hint="default" w:ascii="Arial" w:hAnsi="Arial" w:cs="Arial"/>
+          <w:b w:val="0"/>
+          <w:bCs w:val="0"/>
+          <w:sz w:val="32"/>
+          <w:szCs w:val="32"/>
+          <w:lang w:val="pt-BR"/>
+        </w:rPr>
+      </w:pPr>
+      <w:r>
+        <w:rPr>
+          <w:rFonts w:hint="default" w:ascii="Arial" w:hAnsi="Arial" w:cs="Arial"/>
+          <w:b w:val="0"/>
+          <w:bCs w:val="0"/>
+          <w:sz w:val="32"/>
+          <w:szCs w:val="32"/>
+          <w:lang w:val="pt-BR"/>
+        </w:rPr>
+        <w:t xml:space="preserve">     </w:t>
+      </w:r>
+    </w:p>
+    <w:p>
+      <w:pPr>
+        <w:numPr>
+          <w:numId w:val="0"/>
+        </w:numPr>
+        <w:rPr>
+          <w:rFonts w:hint="default" w:ascii="Arial" w:hAnsi="Arial" w:cs="Arial"/>
+          <w:b w:val="0"/>
+          <w:bCs w:val="0"/>
+          <w:sz w:val="32"/>
+          <w:szCs w:val="32"/>
+          <w:lang w:val="pt-BR"/>
+        </w:rPr>
+      </w:pPr>
+      <w:r>
+        <w:rPr>
+          <w:rFonts w:hint="default" w:ascii="Arial" w:hAnsi="Arial" w:cs="Arial"/>
+          <w:b w:val="0"/>
+          <w:bCs w:val="0"/>
+          <w:sz w:val="32"/>
+          <w:szCs w:val="32"/>
+          <w:lang w:val="pt-BR"/>
+        </w:rPr>
+        <w:t>Aproveitando vamos simular, dois sistemas finais, que para se comunicarem vão passar por 4 nós(roteadores) , primeiro vamos estruturar os dados que vão ser enviados, como vão passar pelos nós, e por último, como vão ser recebidos.</w:t>
+      </w:r>
+    </w:p>
+    <w:p>
+      <w:pPr>
+        <w:numPr>
+          <w:numId w:val="0"/>
+        </w:numPr>
+        <w:rPr>
+          <w:rFonts w:hint="default" w:ascii="Arial" w:hAnsi="Arial" w:cs="Arial"/>
+          <w:b w:val="0"/>
+          <w:bCs w:val="0"/>
+          <w:sz w:val="32"/>
+          <w:szCs w:val="32"/>
+          <w:lang w:val="pt-BR"/>
+        </w:rPr>
+      </w:pPr>
+    </w:p>
+    <w:p>
+      <w:pPr>
+        <w:numPr>
+          <w:numId w:val="0"/>
+        </w:numPr>
+        <w:rPr>
+          <w:rFonts w:hint="default" w:ascii="Arial" w:hAnsi="Arial" w:cs="Arial"/>
+          <w:b w:val="0"/>
+          <w:bCs w:val="0"/>
+          <w:sz w:val="32"/>
+          <w:szCs w:val="32"/>
+          <w:lang w:val="pt-BR"/>
+        </w:rPr>
+      </w:pPr>
+      <w:r>
+        <w:rPr>
+          <w:rFonts w:hint="default" w:ascii="Arial" w:hAnsi="Arial" w:cs="Arial"/>
+          <w:b w:val="0"/>
+          <w:bCs w:val="0"/>
+          <w:sz w:val="32"/>
+          <w:szCs w:val="32"/>
+          <w:lang w:val="pt-BR"/>
+        </w:rPr>
+        <w:t>Em comunicação vertical, o dado vai entrar na camada de aplicação ficando da seguinte forma, dando inicio</w:t>
+      </w:r>
+    </w:p>
+    <w:p>
+      <w:pPr>
+        <w:numPr>
+          <w:numId w:val="0"/>
+        </w:numPr>
+        <w:rPr>
+          <w:rFonts w:hint="default" w:ascii="Arial" w:hAnsi="Arial" w:cs="Arial"/>
+          <w:b w:val="0"/>
+          <w:bCs w:val="0"/>
+          <w:sz w:val="32"/>
+          <w:szCs w:val="32"/>
+          <w:lang w:val="pt-BR"/>
+        </w:rPr>
+      </w:pPr>
+      <w:r>
+        <w:rPr>
+          <w:rFonts w:hint="default" w:ascii="Arial" w:hAnsi="Arial" w:cs="Arial"/>
+          <w:b w:val="0"/>
+          <w:bCs w:val="0"/>
+          <w:sz w:val="32"/>
+          <w:szCs w:val="32"/>
+          <w:lang w:val="pt-BR"/>
+        </w:rPr>
+        <w:t>PDU-APL - Aplicação</w:t>
+      </w:r>
+    </w:p>
+    <w:p>
+      <w:pPr>
+        <w:numPr>
+          <w:numId w:val="0"/>
+        </w:numPr>
+        <w:rPr>
+          <w:rFonts w:hint="default" w:ascii="Arial" w:hAnsi="Arial" w:cs="Arial"/>
+          <w:b w:val="0"/>
+          <w:bCs w:val="0"/>
+          <w:sz w:val="32"/>
+          <w:szCs w:val="32"/>
+          <w:lang w:val="pt-BR"/>
+        </w:rPr>
+      </w:pPr>
+      <w:r>
+        <w:rPr>
+          <w:rFonts w:hint="default" w:ascii="Arial" w:hAnsi="Arial" w:cs="Arial"/>
+          <w:b w:val="0"/>
+          <w:bCs w:val="0"/>
+          <w:sz w:val="32"/>
+          <w:szCs w:val="32"/>
+          <w:lang w:val="pt-BR"/>
+        </w:rPr>
+        <w:t>Vai receber os dados, em uma comunicação vertical, e vai ser encapsulado, dado + cabeçalho gera a (PDU)</w:t>
+      </w:r>
+    </w:p>
+    <w:p>
+      <w:pPr>
+        <w:numPr>
+          <w:numId w:val="0"/>
+        </w:numPr>
+        <w:rPr>
+          <w:rFonts w:hint="default" w:ascii="Arial" w:hAnsi="Arial" w:cs="Arial"/>
+          <w:b w:val="0"/>
+          <w:bCs w:val="0"/>
+          <w:sz w:val="32"/>
+          <w:szCs w:val="32"/>
+          <w:lang w:val="pt-BR"/>
+        </w:rPr>
+      </w:pPr>
+      <w:r>
+        <w:rPr>
+          <w:rFonts w:hint="default" w:ascii="Arial" w:hAnsi="Arial" w:cs="Arial"/>
+          <w:b w:val="0"/>
+          <w:bCs w:val="0"/>
+          <w:sz w:val="32"/>
+          <w:szCs w:val="32"/>
+          <w:lang w:val="pt-BR"/>
+        </w:rPr>
+        <w:t>PDU-APR - Apresentação</w:t>
+      </w:r>
+    </w:p>
+    <w:p>
+      <w:pPr>
+        <w:numPr>
+          <w:numId w:val="0"/>
+        </w:numPr>
+        <w:rPr>
+          <w:rFonts w:hint="default" w:ascii="Arial" w:hAnsi="Arial" w:cs="Arial"/>
+          <w:b w:val="0"/>
+          <w:bCs w:val="0"/>
+          <w:sz w:val="32"/>
+          <w:szCs w:val="32"/>
+          <w:lang w:val="pt-BR"/>
+        </w:rPr>
+      </w:pPr>
+      <w:r>
+        <w:rPr>
+          <w:rFonts w:hint="default" w:ascii="Arial" w:hAnsi="Arial" w:cs="Arial"/>
+          <w:b w:val="0"/>
+          <w:bCs w:val="0"/>
+          <w:sz w:val="32"/>
+          <w:szCs w:val="32"/>
+          <w:lang w:val="pt-BR"/>
+        </w:rPr>
+        <w:t>Vai pegar o dado encapsular e garantir a interoperabilidade, muitas das aplicações pega o dado, transforma para texto e no final faz a conversão de volta (video, foto e etc...)</w:t>
+      </w:r>
+    </w:p>
+    <w:p>
+      <w:pPr>
+        <w:numPr>
+          <w:numId w:val="0"/>
+        </w:numPr>
+        <w:rPr>
+          <w:rFonts w:hint="default" w:ascii="Arial" w:hAnsi="Arial" w:cs="Arial"/>
+          <w:b w:val="0"/>
+          <w:bCs w:val="0"/>
+          <w:sz w:val="32"/>
+          <w:szCs w:val="32"/>
+          <w:lang w:val="pt-BR"/>
+        </w:rPr>
+      </w:pPr>
+      <w:r>
+        <w:rPr>
+          <w:rFonts w:hint="default" w:ascii="Arial" w:hAnsi="Arial" w:cs="Arial"/>
+          <w:b w:val="0"/>
+          <w:bCs w:val="0"/>
+          <w:sz w:val="32"/>
+          <w:szCs w:val="32"/>
+          <w:lang w:val="pt-BR"/>
+        </w:rPr>
+        <w:t>PDU-S - Sessão</w:t>
+      </w:r>
+    </w:p>
+    <w:p>
+      <w:pPr>
+        <w:numPr>
+          <w:numId w:val="0"/>
+        </w:numPr>
+        <w:rPr>
+          <w:rFonts w:hint="default" w:ascii="Arial" w:hAnsi="Arial" w:cs="Arial"/>
+          <w:b w:val="0"/>
+          <w:bCs w:val="0"/>
+          <w:sz w:val="32"/>
+          <w:szCs w:val="32"/>
+          <w:lang w:val="pt-BR"/>
+        </w:rPr>
+      </w:pPr>
+      <w:r>
+        <w:rPr>
+          <w:rFonts w:hint="default" w:ascii="Arial" w:hAnsi="Arial" w:cs="Arial"/>
+          <w:b w:val="0"/>
+          <w:bCs w:val="0"/>
+          <w:sz w:val="32"/>
+          <w:szCs w:val="32"/>
+          <w:lang w:val="pt-BR"/>
+        </w:rPr>
+        <w:t>Vai pegar a PDU de apresentação e estabelecer quem fala, quem não fala, criar pontos de restauração, vai organizar a comunicação.</w:t>
+      </w:r>
+    </w:p>
+    <w:p>
+      <w:pPr>
+        <w:numPr>
+          <w:numId w:val="0"/>
+        </w:numPr>
+        <w:rPr>
+          <w:rFonts w:hint="default" w:ascii="Arial" w:hAnsi="Arial" w:cs="Arial"/>
+          <w:b w:val="0"/>
+          <w:bCs w:val="0"/>
+          <w:sz w:val="32"/>
+          <w:szCs w:val="32"/>
+          <w:lang w:val="pt-BR"/>
+        </w:rPr>
+      </w:pPr>
+      <w:r>
+        <w:rPr>
+          <w:rFonts w:hint="default" w:ascii="Arial" w:hAnsi="Arial" w:cs="Arial"/>
+          <w:b w:val="0"/>
+          <w:bCs w:val="0"/>
+          <w:sz w:val="32"/>
+          <w:szCs w:val="32"/>
+          <w:lang w:val="pt-BR"/>
+        </w:rPr>
+        <w:t>PDU-T - Transporte</w:t>
+      </w:r>
+    </w:p>
+    <w:p>
+      <w:pPr>
+        <w:numPr>
+          <w:numId w:val="0"/>
+        </w:numPr>
+        <w:rPr>
+          <w:rFonts w:hint="default" w:ascii="Arial" w:hAnsi="Arial" w:cs="Arial"/>
+          <w:b w:val="0"/>
+          <w:bCs w:val="0"/>
+          <w:sz w:val="32"/>
+          <w:szCs w:val="32"/>
+          <w:lang w:val="pt-BR"/>
+        </w:rPr>
+      </w:pPr>
+      <w:r>
+        <w:rPr>
+          <w:rFonts w:hint="default" w:ascii="Arial" w:hAnsi="Arial" w:cs="Arial"/>
+          <w:b w:val="0"/>
+          <w:bCs w:val="0"/>
+          <w:sz w:val="32"/>
+          <w:szCs w:val="32"/>
+          <w:lang w:val="pt-BR"/>
+        </w:rPr>
+        <w:t>O transporte vai pegar todas as PDU, que já estão encapsuladas, dividem em 3 chamados de (segmentos), e organizam númericamente, para realizar o transporte, botando em ordem, corrigindo erros, controlando congestionamento, para não sobrecarregar a rede, evitar a sobrecarga da máquina de destino, após tudo isso, pega os três seguimentos e entrega para camada de rede</w:t>
+      </w:r>
+    </w:p>
+    <w:p>
+      <w:pPr>
+        <w:numPr>
+          <w:numId w:val="0"/>
+        </w:numPr>
+        <w:rPr>
+          <w:rFonts w:hint="default" w:ascii="Arial" w:hAnsi="Arial" w:cs="Arial"/>
+          <w:b w:val="0"/>
+          <w:bCs w:val="0"/>
+          <w:sz w:val="32"/>
+          <w:szCs w:val="32"/>
+          <w:lang w:val="pt-BR"/>
+        </w:rPr>
+      </w:pPr>
+      <w:r>
+        <w:rPr>
+          <w:rFonts w:hint="default" w:ascii="Arial" w:hAnsi="Arial" w:cs="Arial"/>
+          <w:b w:val="0"/>
+          <w:bCs w:val="0"/>
+          <w:sz w:val="32"/>
+          <w:szCs w:val="32"/>
+          <w:lang w:val="pt-BR"/>
+        </w:rPr>
+        <w:t>PDU-R - Rede</w:t>
+      </w:r>
+    </w:p>
+    <w:p>
+      <w:pPr>
+        <w:numPr>
+          <w:numId w:val="0"/>
+        </w:numPr>
+        <w:rPr>
+          <w:rFonts w:hint="default" w:ascii="Arial" w:hAnsi="Arial" w:cs="Arial"/>
+          <w:b w:val="0"/>
+          <w:bCs w:val="0"/>
+          <w:sz w:val="32"/>
+          <w:szCs w:val="32"/>
+          <w:lang w:val="pt-BR"/>
+        </w:rPr>
+      </w:pPr>
+      <w:r>
+        <w:rPr>
+          <w:rFonts w:hint="default" w:ascii="Arial" w:hAnsi="Arial" w:cs="Arial"/>
+          <w:b w:val="0"/>
+          <w:bCs w:val="0"/>
+          <w:sz w:val="32"/>
+          <w:szCs w:val="32"/>
+          <w:lang w:val="pt-BR"/>
+        </w:rPr>
+        <w:t>A rede cuida do endereço de destino, e é recebido o endereço de origem e o endereço de destino, para estar especificado, para ser possível trafegar pela internet, sem se perder.</w:t>
+      </w:r>
+    </w:p>
+    <w:p>
+      <w:pPr>
+        <w:numPr>
+          <w:numId w:val="0"/>
+        </w:numPr>
+        <w:rPr>
+          <w:rFonts w:hint="default" w:ascii="Arial" w:hAnsi="Arial" w:cs="Arial"/>
+          <w:b w:val="0"/>
+          <w:bCs w:val="0"/>
+          <w:sz w:val="32"/>
+          <w:szCs w:val="32"/>
+          <w:lang w:val="pt-BR"/>
+        </w:rPr>
+      </w:pPr>
+    </w:p>
+    <w:p>
+      <w:pPr>
+        <w:numPr>
+          <w:numId w:val="0"/>
+        </w:numPr>
+        <w:rPr>
+          <w:rFonts w:hint="default" w:ascii="Arial" w:hAnsi="Arial" w:cs="Arial"/>
+          <w:b w:val="0"/>
+          <w:bCs w:val="0"/>
+          <w:sz w:val="32"/>
+          <w:szCs w:val="32"/>
+          <w:lang w:val="pt-BR"/>
+        </w:rPr>
+      </w:pPr>
+      <w:r>
+        <w:rPr>
+          <w:rFonts w:hint="default" w:ascii="Arial" w:hAnsi="Arial" w:cs="Arial"/>
+          <w:b w:val="0"/>
+          <w:bCs w:val="0"/>
+          <w:sz w:val="32"/>
+          <w:szCs w:val="32"/>
+          <w:lang w:val="pt-BR"/>
+        </w:rPr>
+        <w:t>PDU-E - Enlace</w:t>
+      </w:r>
+    </w:p>
+    <w:p>
+      <w:pPr>
+        <w:numPr>
+          <w:numId w:val="0"/>
+        </w:numPr>
+        <w:rPr>
+          <w:rFonts w:hint="default" w:ascii="Arial" w:hAnsi="Arial" w:cs="Arial"/>
+          <w:b w:val="0"/>
+          <w:bCs w:val="0"/>
+          <w:sz w:val="32"/>
+          <w:szCs w:val="32"/>
+          <w:lang w:val="pt-BR"/>
+        </w:rPr>
+      </w:pPr>
+      <w:r>
+        <w:rPr>
+          <w:rFonts w:hint="default" w:ascii="Arial" w:hAnsi="Arial" w:cs="Arial"/>
+          <w:b w:val="0"/>
+          <w:bCs w:val="0"/>
+          <w:sz w:val="32"/>
+          <w:szCs w:val="32"/>
+          <w:lang w:val="pt-BR"/>
+        </w:rPr>
+        <w:t>Faz a segurança de que os dados vão transmitir com confiabilidade de que vão chegar perfeitos, para ser lidos pelo destino.</w:t>
+      </w:r>
+    </w:p>
+    <w:p>
+      <w:pPr>
+        <w:numPr>
+          <w:numId w:val="0"/>
+        </w:numPr>
+        <w:rPr>
+          <w:rFonts w:hint="default" w:ascii="Arial" w:hAnsi="Arial" w:cs="Arial"/>
+          <w:b w:val="0"/>
+          <w:bCs w:val="0"/>
+          <w:sz w:val="32"/>
+          <w:szCs w:val="32"/>
+          <w:lang w:val="pt-BR"/>
+        </w:rPr>
+      </w:pPr>
+      <w:r>
+        <w:rPr>
+          <w:rFonts w:hint="default" w:ascii="Arial" w:hAnsi="Arial" w:cs="Arial"/>
+          <w:b w:val="0"/>
+          <w:bCs w:val="0"/>
+          <w:sz w:val="32"/>
+          <w:szCs w:val="32"/>
+          <w:lang w:val="pt-BR"/>
+        </w:rPr>
+        <w:t>Fisico</w:t>
+      </w:r>
+    </w:p>
+    <w:p>
+      <w:pPr>
+        <w:numPr>
+          <w:numId w:val="0"/>
+        </w:numPr>
+        <w:rPr>
+          <w:rFonts w:hint="default" w:ascii="Arial" w:hAnsi="Arial" w:cs="Arial"/>
+          <w:b w:val="0"/>
+          <w:bCs w:val="0"/>
+          <w:sz w:val="32"/>
+          <w:szCs w:val="32"/>
+          <w:lang w:val="pt-BR"/>
+        </w:rPr>
+      </w:pPr>
+      <w:r>
+        <w:rPr>
+          <w:rFonts w:hint="default" w:ascii="Arial" w:hAnsi="Arial" w:cs="Arial"/>
+          <w:b w:val="0"/>
+          <w:bCs w:val="0"/>
+          <w:sz w:val="32"/>
+          <w:szCs w:val="32"/>
+          <w:lang w:val="pt-BR"/>
+        </w:rPr>
+        <w:t>Sequencia de bits (0 e 1) transforma em algum tipo de sinal para ser enviado pelo caminho de comunicação, esse caminho de comunicação depende do tipo de transmissão.</w:t>
+      </w:r>
+    </w:p>
+    <w:p>
+      <w:pPr>
+        <w:numPr>
+          <w:numId w:val="0"/>
+        </w:numPr>
+        <w:rPr>
+          <w:rFonts w:hint="default" w:ascii="Arial" w:hAnsi="Arial" w:cs="Arial"/>
+          <w:b w:val="0"/>
+          <w:bCs w:val="0"/>
+          <w:sz w:val="32"/>
+          <w:szCs w:val="32"/>
+          <w:lang w:val="pt-BR"/>
+        </w:rPr>
+      </w:pPr>
+    </w:p>
+    <w:p>
+      <w:pPr>
+        <w:numPr>
+          <w:numId w:val="0"/>
+        </w:numPr>
+        <w:rPr>
+          <w:rFonts w:hint="default" w:ascii="Arial" w:hAnsi="Arial" w:cs="Arial"/>
+          <w:b w:val="0"/>
+          <w:bCs w:val="0"/>
+          <w:sz w:val="32"/>
+          <w:szCs w:val="32"/>
+          <w:lang w:val="pt-BR"/>
+        </w:rPr>
+      </w:pPr>
+      <w:r>
+        <w:rPr>
+          <w:rFonts w:hint="default" w:ascii="Arial" w:hAnsi="Arial" w:cs="Arial"/>
+          <w:b w:val="0"/>
+          <w:bCs w:val="0"/>
+          <w:sz w:val="32"/>
+          <w:szCs w:val="32"/>
+          <w:lang w:val="pt-BR"/>
+        </w:rPr>
+        <w:t>Após isso os dados vão transitar em todas as placas de redes (fisico) que forem necessários, até chegar destino.</w:t>
+      </w:r>
+    </w:p>
+    <w:p>
+      <w:pPr>
+        <w:numPr>
+          <w:numId w:val="0"/>
+        </w:numPr>
+        <w:rPr>
+          <w:rFonts w:hint="default" w:ascii="Arial" w:hAnsi="Arial" w:cs="Arial"/>
+          <w:b w:val="0"/>
+          <w:bCs w:val="0"/>
+          <w:sz w:val="32"/>
+          <w:szCs w:val="32"/>
+          <w:lang w:val="pt-BR"/>
+        </w:rPr>
+      </w:pPr>
+      <w:r>
+        <w:rPr>
+          <w:rFonts w:hint="default" w:ascii="Arial" w:hAnsi="Arial" w:cs="Arial"/>
+          <w:b w:val="0"/>
+          <w:bCs w:val="0"/>
+          <w:sz w:val="32"/>
+          <w:szCs w:val="32"/>
+          <w:lang w:val="pt-BR"/>
+        </w:rPr>
+        <w:t>E faz o mesmo fluxo porém ao contrário lá no destino.</w:t>
+      </w:r>
+    </w:p>
+    <w:p>
+      <w:pPr>
+        <w:numPr>
+          <w:numId w:val="0"/>
+        </w:numPr>
+        <w:rPr>
+          <w:rFonts w:hint="default" w:ascii="Arial" w:hAnsi="Arial" w:cs="Arial"/>
+          <w:b w:val="0"/>
+          <w:bCs w:val="0"/>
+          <w:sz w:val="32"/>
+          <w:szCs w:val="32"/>
+          <w:lang w:val="pt-BR"/>
+        </w:rPr>
+      </w:pPr>
+    </w:p>
+    <w:p>
+      <w:pPr>
+        <w:numPr>
+          <w:numId w:val="0"/>
+        </w:numPr>
+        <w:rPr>
+          <w:rFonts w:hint="default" w:ascii="Arial" w:hAnsi="Arial" w:cs="Arial"/>
+          <w:b/>
+          <w:bCs/>
+          <w:sz w:val="32"/>
+          <w:szCs w:val="32"/>
+          <w:lang w:val="pt-BR" w:eastAsia="zh-CN"/>
+        </w:rPr>
+      </w:pPr>
+      <w:r>
+        <w:rPr>
+          <w:rFonts w:hint="default" w:ascii="Arial" w:hAnsi="Arial" w:cs="Arial"/>
+          <w:b/>
+          <w:bCs/>
+          <w:sz w:val="32"/>
+          <w:szCs w:val="32"/>
+          <w:lang w:val="pt-BR" w:eastAsia="zh-CN"/>
+        </w:rPr>
+        <w:t>Arquitetura e evolução do protocolo TCP/IP</w:t>
+      </w:r>
+    </w:p>
+    <w:p>
+      <w:pPr>
+        <w:numPr>
+          <w:numId w:val="0"/>
+        </w:numPr>
+        <w:rPr>
+          <w:rFonts w:hint="default" w:ascii="Arial" w:hAnsi="Arial" w:cs="Arial"/>
+          <w:b w:val="0"/>
+          <w:bCs w:val="0"/>
+          <w:sz w:val="32"/>
+          <w:szCs w:val="32"/>
+          <w:lang w:val="pt-BR" w:eastAsia="zh-CN"/>
+        </w:rPr>
+      </w:pPr>
+      <w:r>
+        <w:rPr>
+          <w:rFonts w:hint="default" w:ascii="Arial" w:hAnsi="Arial" w:cs="Arial"/>
+          <w:b w:val="0"/>
+          <w:bCs w:val="0"/>
+          <w:sz w:val="32"/>
+          <w:szCs w:val="32"/>
+          <w:lang w:val="pt-BR" w:eastAsia="zh-CN"/>
+        </w:rPr>
+        <w:t>Conhecendo um pouco mais do protocolo TCP/IP, a arquitetura foi batizada com esse nome por conta dos seus dois principais protocolos sendo eles, Transmission Control Protocol (TCP) e Internet Protocol (IP), apresentada pela primeira vez em 1974, com uma arquitetura que interligava diversas redes de comunicação, adotada posteriormente como padrão para a comunidade Internet.</w:t>
+      </w:r>
+    </w:p>
+    <w:p>
+      <w:pPr>
+        <w:numPr>
+          <w:numId w:val="0"/>
+        </w:numPr>
+        <w:rPr>
+          <w:rFonts w:hint="default" w:ascii="Arial" w:hAnsi="Arial" w:cs="Arial"/>
+          <w:b w:val="0"/>
+          <w:bCs w:val="0"/>
+          <w:sz w:val="32"/>
+          <w:szCs w:val="32"/>
+          <w:lang w:val="pt-BR" w:eastAsia="zh-CN"/>
+        </w:rPr>
+      </w:pPr>
+      <w:r>
+        <w:rPr>
+          <w:rFonts w:hint="default" w:ascii="Arial" w:hAnsi="Arial" w:cs="Arial"/>
+          <w:b w:val="0"/>
+          <w:bCs w:val="0"/>
+          <w:sz w:val="32"/>
+          <w:szCs w:val="32"/>
+          <w:lang w:val="pt-BR" w:eastAsia="zh-CN"/>
+        </w:rPr>
+        <w:t>Em sua criação ela foi arquitetada com quatro camadas: Aplicação, Transporte, Internet e Acesso à rede.</w:t>
+      </w:r>
+    </w:p>
+    <w:p>
+      <w:pPr>
+        <w:numPr>
+          <w:numId w:val="0"/>
+        </w:numPr>
+        <w:rPr>
+          <w:rFonts w:hint="default" w:ascii="Arial" w:hAnsi="Arial" w:cs="Arial"/>
+          <w:b w:val="0"/>
+          <w:bCs w:val="0"/>
+          <w:sz w:val="32"/>
+          <w:szCs w:val="32"/>
+          <w:lang w:val="pt-BR" w:eastAsia="zh-CN"/>
+        </w:rPr>
+      </w:pPr>
+      <w:r>
+        <w:rPr>
+          <w:rFonts w:hint="default" w:ascii="Arial" w:hAnsi="Arial" w:cs="Arial"/>
+          <w:b w:val="0"/>
+          <w:bCs w:val="0"/>
+          <w:sz w:val="32"/>
+          <w:szCs w:val="32"/>
+          <w:lang w:val="pt-BR" w:eastAsia="zh-CN"/>
+        </w:rPr>
+        <w:t>As duas ultimas camadas podem ser encontradas com nomes diferentes na literatura, a internet pode aparecer como (rede e inter-rede) e a camada de acesso à rede pode ser encontrada como (Enlace, Host-rede, Intrarrede e Host-network)</w:t>
+      </w:r>
+    </w:p>
+    <w:p>
+      <w:pPr>
+        <w:numPr>
+          <w:numId w:val="0"/>
+        </w:numPr>
+      </w:pPr>
+      <w:r>
+        <w:drawing>
+          <wp:inline distT="0" distB="0" distL="114300" distR="114300">
+            <wp:extent cx="4038600" cy="3733800"/>
+            <wp:effectExtent l="0" t="0" r="0" b="0"/>
+            <wp:docPr id="13" name="Imagem 13"/>
+            <wp:cNvGraphicFramePr>
+              <a:graphicFrameLocks xmlns:a="http://schemas.openxmlformats.org/drawingml/2006/main" noChangeAspect="1"/>
+            </wp:cNvGraphicFramePr>
+            <a:graphic xmlns:a="http://schemas.openxmlformats.org/drawingml/2006/main">
+              <a:graphicData uri="http://schemas.openxmlformats.org/drawingml/2006/picture">
+                <pic:pic xmlns:pic="http://schemas.openxmlformats.org/drawingml/2006/picture">
+                  <pic:nvPicPr>
+                    <pic:cNvPr id="13" name="Imagem 13"/>
+                    <pic:cNvPicPr>
+                      <a:picLocks noChangeAspect="1"/>
+                    </pic:cNvPicPr>
+                  </pic:nvPicPr>
+                  <pic:blipFill>
+                    <a:blip r:embed="rId13"/>
+                    <a:stretch>
+                      <a:fillRect/>
+                    </a:stretch>
+                  </pic:blipFill>
+                  <pic:spPr>
+                    <a:xfrm>
+                      <a:off x="0" y="0"/>
+                      <a:ext cx="4038600" cy="3733800"/>
+                    </a:xfrm>
+                    <a:prstGeom prst="rect">
+                      <a:avLst/>
+                    </a:prstGeom>
+                    <a:noFill/>
+                    <a:ln>
+                      <a:noFill/>
+                    </a:ln>
+                  </pic:spPr>
+                </pic:pic>
+              </a:graphicData>
+            </a:graphic>
+          </wp:inline>
+        </w:drawing>
+      </w:r>
+    </w:p>
+    <w:p>
+      <w:pPr>
+        <w:numPr>
+          <w:numId w:val="0"/>
+        </w:numPr>
+        <w:rPr>
+          <w:rFonts w:hint="default" w:ascii="Arial" w:hAnsi="Arial" w:cs="Arial"/>
+          <w:sz w:val="32"/>
+          <w:szCs w:val="32"/>
+          <w:lang w:val="pt-BR" w:eastAsia="zh-CN"/>
+        </w:rPr>
+      </w:pPr>
+      <w:r>
+        <w:rPr>
+          <w:rFonts w:hint="default" w:ascii="Arial" w:hAnsi="Arial" w:cs="Arial"/>
+          <w:sz w:val="32"/>
+          <w:szCs w:val="32"/>
+          <w:lang w:val="pt-BR" w:eastAsia="zh-CN"/>
+        </w:rPr>
+        <w:t>Vendo a arquitetura TCP/IP, notamos que algumas das camadas do modelo OSI, não estão presente, e a causa disso, é que foram englobadas em outras camadas dessas quatro, vamos ver como isso fica</w:t>
+      </w:r>
+    </w:p>
+    <w:p>
+      <w:pPr>
+        <w:numPr>
+          <w:numId w:val="0"/>
+        </w:numPr>
+        <w:rPr>
+          <w:rFonts w:hint="default" w:ascii="Arial" w:hAnsi="Arial" w:cs="Arial"/>
+          <w:sz w:val="32"/>
+          <w:szCs w:val="32"/>
+          <w:lang w:val="pt-BR" w:eastAsia="zh-CN"/>
+        </w:rPr>
+      </w:pPr>
+      <w:r>
+        <w:rPr>
+          <w:rFonts w:hint="default" w:ascii="Arial" w:hAnsi="Arial" w:cs="Arial"/>
+          <w:sz w:val="32"/>
+          <w:szCs w:val="32"/>
+          <w:lang w:val="pt-BR" w:eastAsia="zh-CN"/>
+        </w:rPr>
+        <w:t>As camadas apresentação e sessão foram incorporadas pela camada de aplicação, e as camadas enlace e fisica foram incorporadas pela camada de acesso à rede.</w:t>
+      </w:r>
+    </w:p>
+    <w:p>
+      <w:pPr>
+        <w:numPr>
+          <w:numId w:val="0"/>
+        </w:numPr>
+      </w:pPr>
+      <w:r>
+        <w:drawing>
+          <wp:inline distT="0" distB="0" distL="114300" distR="114300">
+            <wp:extent cx="5267325" cy="3962400"/>
+            <wp:effectExtent l="0" t="0" r="5715" b="0"/>
+            <wp:docPr id="14" name="Imagem 14"/>
+            <wp:cNvGraphicFramePr>
+              <a:graphicFrameLocks xmlns:a="http://schemas.openxmlformats.org/drawingml/2006/main" noChangeAspect="1"/>
+            </wp:cNvGraphicFramePr>
+            <a:graphic xmlns:a="http://schemas.openxmlformats.org/drawingml/2006/main">
+              <a:graphicData uri="http://schemas.openxmlformats.org/drawingml/2006/picture">
+                <pic:pic xmlns:pic="http://schemas.openxmlformats.org/drawingml/2006/picture">
+                  <pic:nvPicPr>
+                    <pic:cNvPr id="14" name="Imagem 14"/>
+                    <pic:cNvPicPr>
+                      <a:picLocks noChangeAspect="1"/>
+                    </pic:cNvPicPr>
+                  </pic:nvPicPr>
+                  <pic:blipFill>
+                    <a:blip r:embed="rId14"/>
+                    <a:stretch>
+                      <a:fillRect/>
+                    </a:stretch>
+                  </pic:blipFill>
+                  <pic:spPr>
+                    <a:xfrm>
+                      <a:off x="0" y="0"/>
+                      <a:ext cx="5267325" cy="3962400"/>
+                    </a:xfrm>
+                    <a:prstGeom prst="rect">
+                      <a:avLst/>
+                    </a:prstGeom>
+                    <a:noFill/>
+                    <a:ln>
+                      <a:noFill/>
+                    </a:ln>
+                  </pic:spPr>
+                </pic:pic>
+              </a:graphicData>
+            </a:graphic>
+          </wp:inline>
+        </w:drawing>
+      </w:r>
+    </w:p>
+    <w:p>
+      <w:pPr>
+        <w:numPr>
+          <w:numId w:val="0"/>
+        </w:numPr>
+        <w:rPr>
+          <w:rFonts w:hint="default" w:ascii="Arial" w:hAnsi="Arial" w:cs="Arial"/>
+          <w:sz w:val="32"/>
+          <w:szCs w:val="32"/>
+          <w:lang w:val="pt-BR" w:eastAsia="zh-CN"/>
+        </w:rPr>
+      </w:pPr>
+      <w:r>
+        <w:rPr>
+          <w:rFonts w:hint="default" w:ascii="Arial" w:hAnsi="Arial" w:cs="Arial"/>
+          <w:sz w:val="32"/>
+          <w:szCs w:val="32"/>
+          <w:lang w:val="pt-BR" w:eastAsia="zh-CN"/>
+        </w:rPr>
+        <w:t>A grande diferença entre o modelo de referencia e a arquitetura é:</w:t>
+      </w:r>
+    </w:p>
+    <w:p>
+      <w:pPr>
+        <w:numPr>
+          <w:numId w:val="0"/>
+        </w:numPr>
+        <w:rPr>
+          <w:rFonts w:hint="default" w:ascii="Arial" w:hAnsi="Arial" w:cs="Arial"/>
+          <w:sz w:val="32"/>
+          <w:szCs w:val="32"/>
+          <w:lang w:val="pt-BR" w:eastAsia="zh-CN"/>
+        </w:rPr>
+      </w:pPr>
+      <w:r>
+        <w:rPr>
+          <w:rFonts w:hint="default" w:ascii="Arial" w:hAnsi="Arial" w:cs="Arial"/>
+          <w:sz w:val="32"/>
+          <w:szCs w:val="32"/>
+          <w:lang w:val="pt-BR" w:eastAsia="zh-CN"/>
+        </w:rPr>
+        <w:t>Modelo OSI; É baseado principalmente, nas funcionalidades das camadas.</w:t>
+      </w:r>
+    </w:p>
+    <w:p>
+      <w:pPr>
+        <w:numPr>
+          <w:numId w:val="0"/>
+        </w:numPr>
+        <w:rPr>
+          <w:rFonts w:hint="default" w:ascii="Arial" w:hAnsi="Arial" w:cs="Arial"/>
+          <w:sz w:val="32"/>
+          <w:szCs w:val="32"/>
+          <w:lang w:val="pt-BR" w:eastAsia="zh-CN"/>
+        </w:rPr>
+      </w:pPr>
+      <w:r>
+        <w:rPr>
+          <w:rFonts w:hint="default" w:ascii="Arial" w:hAnsi="Arial" w:cs="Arial"/>
+          <w:sz w:val="32"/>
+          <w:szCs w:val="32"/>
+          <w:lang w:val="pt-BR" w:eastAsia="zh-CN"/>
+        </w:rPr>
+        <w:t>Arquitetura TCP/IP; Não ficou presa apenas nas funcionalidades, se ampliou para o desenvolvimento dos protocolos independentes e hierárquicos, baseando-se em protocolos de nível superior que é suportado pelos protocolos de nivel inferior.</w:t>
+      </w:r>
+    </w:p>
+    <w:p>
+      <w:pPr>
+        <w:numPr>
+          <w:numId w:val="0"/>
+        </w:numPr>
+        <w:rPr>
+          <w:rFonts w:hint="default" w:ascii="Arial" w:hAnsi="Arial" w:cs="Arial"/>
+          <w:sz w:val="32"/>
+          <w:szCs w:val="32"/>
+          <w:lang w:val="pt-BR" w:eastAsia="zh-CN"/>
+        </w:rPr>
+      </w:pPr>
+    </w:p>
+    <w:p>
+      <w:pPr>
+        <w:numPr>
+          <w:numId w:val="0"/>
+        </w:numPr>
+        <w:rPr>
+          <w:rFonts w:hint="default" w:ascii="Arial" w:hAnsi="Arial" w:cs="Arial"/>
+          <w:sz w:val="32"/>
+          <w:szCs w:val="32"/>
+          <w:lang w:val="pt-BR" w:eastAsia="zh-CN"/>
+        </w:rPr>
+      </w:pPr>
+      <w:r>
+        <w:rPr>
+          <w:rFonts w:hint="default" w:ascii="Arial" w:hAnsi="Arial" w:cs="Arial"/>
+          <w:sz w:val="32"/>
+          <w:szCs w:val="32"/>
+          <w:lang w:val="pt-BR" w:eastAsia="zh-CN"/>
+        </w:rPr>
+        <w:t>É comum ouvirmos falar da pilha de protocolos TCP/IP, se trata do conjunto de todos os protocolos implementados pela arquitetura. E não são poucos.</w:t>
+      </w:r>
+    </w:p>
+    <w:p>
+      <w:pPr>
+        <w:numPr>
+          <w:numId w:val="0"/>
+        </w:numPr>
+        <w:rPr>
+          <w:rFonts w:hint="default" w:ascii="Arial" w:hAnsi="Arial" w:cs="Arial"/>
+          <w:sz w:val="32"/>
+          <w:szCs w:val="32"/>
+          <w:lang w:val="pt-BR" w:eastAsia="zh-CN"/>
+        </w:rPr>
+      </w:pPr>
+      <w:r>
+        <w:rPr>
+          <w:rFonts w:hint="default" w:ascii="Arial" w:hAnsi="Arial" w:cs="Arial"/>
+          <w:sz w:val="32"/>
+          <w:szCs w:val="32"/>
+          <w:lang w:val="pt-BR" w:eastAsia="zh-CN"/>
+        </w:rPr>
+        <w:t>Os principais protocolos de padrão aberto da arquitetura Internet foram desenvolvidos pelo IETF(The Internet Engineering Task Force), por fornecedores e pesquisadores preocupados com a evolução da arquitetura da internet.</w:t>
+      </w:r>
+    </w:p>
+    <w:p>
+      <w:pPr>
+        <w:numPr>
+          <w:numId w:val="0"/>
+        </w:numPr>
+        <w:rPr>
+          <w:rFonts w:hint="default" w:ascii="Arial" w:hAnsi="Arial" w:cs="Arial"/>
+          <w:sz w:val="32"/>
+          <w:szCs w:val="32"/>
+          <w:lang w:val="pt-BR" w:eastAsia="zh-CN"/>
+        </w:rPr>
+      </w:pPr>
+    </w:p>
+    <w:p>
+      <w:pPr>
+        <w:numPr>
+          <w:numId w:val="0"/>
+        </w:numPr>
+        <w:rPr>
+          <w:rFonts w:hint="default" w:ascii="Arial" w:hAnsi="Arial" w:cs="Arial"/>
+          <w:b/>
+          <w:bCs/>
+          <w:sz w:val="32"/>
+          <w:szCs w:val="32"/>
+          <w:lang w:val="pt-BR" w:eastAsia="zh-CN"/>
+        </w:rPr>
+      </w:pPr>
+      <w:r>
+        <w:rPr>
+          <w:rFonts w:hint="default" w:ascii="Arial" w:hAnsi="Arial" w:cs="Arial"/>
+          <w:b/>
+          <w:bCs/>
+          <w:sz w:val="32"/>
+          <w:szCs w:val="32"/>
+          <w:lang w:val="pt-BR" w:eastAsia="zh-CN"/>
+        </w:rPr>
+        <w:t>Camadas: Funções e principais protocolos</w:t>
+      </w:r>
       <w:bookmarkStart w:id="0" w:name="_GoBack"/>
       <w:bookmarkEnd w:id="0"/>
-    </w:p>
-    <w:p>
-      <w:pPr>
-        <w:numPr>
-          <w:numId w:val="0"/>
-        </w:numPr>
-        <w:ind w:leftChars="0"/>
-        <w:rPr>
-          <w:rFonts w:hint="default" w:ascii="Arial" w:hAnsi="Arial" w:cs="Arial"/>
-          <w:b w:val="0"/>
-          <w:bCs w:val="0"/>
-          <w:sz w:val="32"/>
-          <w:szCs w:val="32"/>
-          <w:lang w:val="pt-BR"/>
-        </w:rPr>
-      </w:pPr>
-    </w:p>
-    <w:p>
-      <w:pPr>
-        <w:rPr>
-          <w:rFonts w:hint="default" w:ascii="__Inter_Fallback_611a59" w:hAnsi="__Inter_Fallback_611a59" w:eastAsia="__Inter_Fallback_611a59" w:cs="__Inter_Fallback_611a59"/>
-          <w:i w:val="0"/>
-          <w:iCs w:val="0"/>
-          <w:caps w:val="0"/>
-          <w:color w:val="000000"/>
-          <w:spacing w:val="0"/>
-          <w:kern w:val="0"/>
-          <w:sz w:val="27"/>
-          <w:szCs w:val="27"/>
-          <w:bdr w:val="single" w:color="auto" w:sz="2" w:space="0"/>
-          <w:shd w:val="clear" w:fill="FFFFFF"/>
-          <w:lang w:val="pt-BR" w:eastAsia="zh-CN" w:bidi="ar"/>
-          <w14:ligatures w14:val="standardContextual"/>
-        </w:rPr>
-      </w:pPr>
     </w:p>
     <w:sectPr>
       <w:pgSz w:w="11906" w:h="16838"/>
@@ -3207,9 +5427,9 @@
 <file path=word/numbering.xml><?xml version="1.0" encoding="utf-8"?>
 <w:numbering xmlns:wpc="http://schemas.microsoft.com/office/word/2010/wordprocessingCanvas" xmlns:mc="http://schemas.openxmlformats.org/markup-compatibility/2006" xmlns:o="urn:schemas-microsoft-com:office:office" xmlns:r="http://schemas.openxmlformats.org/officeDocument/2006/relationships" xmlns:m="http://schemas.openxmlformats.org/officeDocument/2006/math" xmlns:v="urn:schemas-microsoft-com:vml" xmlns:wp14="http://schemas.microsoft.com/office/word/2010/wordprocessingDrawing" xmlns:wp="http://schemas.openxmlformats.org/drawingml/2006/wordprocessingDrawing" xmlns:w10="urn:schemas-microsoft-com:office:word" xmlns:w="http://schemas.openxmlformats.org/wordprocessingml/2006/main" xmlns:w14="http://schemas.microsoft.com/office/word/2010/wordml" xmlns:wpg="http://schemas.microsoft.com/office/word/2010/wordprocessingGroup" xmlns:wpi="http://schemas.microsoft.com/office/word/2010/wordprocessingInk" xmlns:wne="http://schemas.microsoft.com/office/word/2006/wordml" xmlns:wps="http://schemas.microsoft.com/office/word/2010/wordprocessingShape" xmlns:wpsCustomData="http://www.wps.cn/officeDocument/2013/wpsCustomData" mc:Ignorable="w14 wp14">
   <w:abstractNum w:abstractNumId="0">
-    <w:nsid w:val="7F0B2AAD"/>
+    <w:nsid w:val="01F8A371"/>
     <w:multiLevelType w:val="multilevel"/>
-    <w:tmpl w:val="7F0B2AAD"/>
+    <w:tmpl w:val="01F8A371"/>
     <w:lvl w:ilvl="0" w:tentative="0">
       <w:start w:val="1"/>
       <w:numFmt w:val="bullet"/>
@@ -3346,8 +5566,437 @@
       </w:rPr>
     </w:lvl>
   </w:abstractNum>
+  <w:abstractNum w:abstractNumId="1">
+    <w:nsid w:val="07AC562C"/>
+    <w:multiLevelType w:val="multilevel"/>
+    <w:tmpl w:val="07AC562C"/>
+    <w:lvl w:ilvl="0" w:tentative="0">
+      <w:start w:val="1"/>
+      <w:numFmt w:val="bullet"/>
+      <w:lvlText w:val=""/>
+      <w:lvlJc w:val="left"/>
+      <w:pPr>
+        <w:tabs>
+          <w:tab w:val="left" w:pos="420"/>
+        </w:tabs>
+        <w:ind w:left="420" w:leftChars="0" w:hanging="420" w:firstLineChars="0"/>
+      </w:pPr>
+      <w:rPr>
+        <w:rFonts w:hint="default" w:ascii="Wingdings" w:hAnsi="Wingdings"/>
+      </w:rPr>
+    </w:lvl>
+    <w:lvl w:ilvl="1" w:tentative="0">
+      <w:start w:val="1"/>
+      <w:numFmt w:val="bullet"/>
+      <w:lvlText w:val=""/>
+      <w:lvlJc w:val="left"/>
+      <w:pPr>
+        <w:tabs>
+          <w:tab w:val="left" w:pos="840"/>
+        </w:tabs>
+        <w:ind w:left="840" w:leftChars="0" w:hanging="420" w:firstLineChars="0"/>
+      </w:pPr>
+      <w:rPr>
+        <w:rFonts w:hint="default" w:ascii="Wingdings" w:hAnsi="Wingdings"/>
+      </w:rPr>
+    </w:lvl>
+    <w:lvl w:ilvl="2" w:tentative="0">
+      <w:start w:val="1"/>
+      <w:numFmt w:val="bullet"/>
+      <w:lvlText w:val=""/>
+      <w:lvlJc w:val="left"/>
+      <w:pPr>
+        <w:tabs>
+          <w:tab w:val="left" w:pos="1260"/>
+        </w:tabs>
+        <w:ind w:left="1260" w:leftChars="0" w:hanging="420" w:firstLineChars="0"/>
+      </w:pPr>
+      <w:rPr>
+        <w:rFonts w:hint="default" w:ascii="Wingdings" w:hAnsi="Wingdings"/>
+      </w:rPr>
+    </w:lvl>
+    <w:lvl w:ilvl="3" w:tentative="0">
+      <w:start w:val="1"/>
+      <w:numFmt w:val="bullet"/>
+      <w:lvlText w:val=""/>
+      <w:lvlJc w:val="left"/>
+      <w:pPr>
+        <w:tabs>
+          <w:tab w:val="left" w:pos="1680"/>
+        </w:tabs>
+        <w:ind w:left="1680" w:leftChars="0" w:hanging="420" w:firstLineChars="0"/>
+      </w:pPr>
+      <w:rPr>
+        <w:rFonts w:hint="default" w:ascii="Wingdings" w:hAnsi="Wingdings"/>
+      </w:rPr>
+    </w:lvl>
+    <w:lvl w:ilvl="4" w:tentative="0">
+      <w:start w:val="1"/>
+      <w:numFmt w:val="bullet"/>
+      <w:lvlText w:val=""/>
+      <w:lvlJc w:val="left"/>
+      <w:pPr>
+        <w:tabs>
+          <w:tab w:val="left" w:pos="2100"/>
+        </w:tabs>
+        <w:ind w:left="2100" w:leftChars="0" w:hanging="420" w:firstLineChars="0"/>
+      </w:pPr>
+      <w:rPr>
+        <w:rFonts w:hint="default" w:ascii="Wingdings" w:hAnsi="Wingdings"/>
+      </w:rPr>
+    </w:lvl>
+    <w:lvl w:ilvl="5" w:tentative="0">
+      <w:start w:val="1"/>
+      <w:numFmt w:val="bullet"/>
+      <w:lvlText w:val=""/>
+      <w:lvlJc w:val="left"/>
+      <w:pPr>
+        <w:tabs>
+          <w:tab w:val="left" w:pos="2520"/>
+        </w:tabs>
+        <w:ind w:left="2520" w:leftChars="0" w:hanging="420" w:firstLineChars="0"/>
+      </w:pPr>
+      <w:rPr>
+        <w:rFonts w:hint="default" w:ascii="Wingdings" w:hAnsi="Wingdings"/>
+      </w:rPr>
+    </w:lvl>
+    <w:lvl w:ilvl="6" w:tentative="0">
+      <w:start w:val="1"/>
+      <w:numFmt w:val="bullet"/>
+      <w:lvlText w:val=""/>
+      <w:lvlJc w:val="left"/>
+      <w:pPr>
+        <w:tabs>
+          <w:tab w:val="left" w:pos="2940"/>
+        </w:tabs>
+        <w:ind w:left="2940" w:leftChars="0" w:hanging="420" w:firstLineChars="0"/>
+      </w:pPr>
+      <w:rPr>
+        <w:rFonts w:hint="default" w:ascii="Wingdings" w:hAnsi="Wingdings"/>
+      </w:rPr>
+    </w:lvl>
+    <w:lvl w:ilvl="7" w:tentative="0">
+      <w:start w:val="1"/>
+      <w:numFmt w:val="bullet"/>
+      <w:lvlText w:val=""/>
+      <w:lvlJc w:val="left"/>
+      <w:pPr>
+        <w:tabs>
+          <w:tab w:val="left" w:pos="3360"/>
+        </w:tabs>
+        <w:ind w:left="3360" w:leftChars="0" w:hanging="420" w:firstLineChars="0"/>
+      </w:pPr>
+      <w:rPr>
+        <w:rFonts w:hint="default" w:ascii="Wingdings" w:hAnsi="Wingdings"/>
+      </w:rPr>
+    </w:lvl>
+    <w:lvl w:ilvl="8" w:tentative="0">
+      <w:start w:val="1"/>
+      <w:numFmt w:val="bullet"/>
+      <w:lvlText w:val=""/>
+      <w:lvlJc w:val="left"/>
+      <w:pPr>
+        <w:tabs>
+          <w:tab w:val="left" w:pos="3780"/>
+        </w:tabs>
+        <w:ind w:left="3780" w:leftChars="0" w:hanging="420" w:firstLineChars="0"/>
+      </w:pPr>
+      <w:rPr>
+        <w:rFonts w:hint="default" w:ascii="Wingdings" w:hAnsi="Wingdings"/>
+      </w:rPr>
+    </w:lvl>
+  </w:abstractNum>
+  <w:abstractNum w:abstractNumId="2">
+    <w:nsid w:val="26D17F4E"/>
+    <w:multiLevelType w:val="multilevel"/>
+    <w:tmpl w:val="26D17F4E"/>
+    <w:lvl w:ilvl="0" w:tentative="0">
+      <w:start w:val="1"/>
+      <w:numFmt w:val="bullet"/>
+      <w:lvlText w:val=""/>
+      <w:lvlJc w:val="left"/>
+      <w:pPr>
+        <w:tabs>
+          <w:tab w:val="left" w:pos="420"/>
+        </w:tabs>
+        <w:ind w:left="420" w:leftChars="0" w:hanging="420" w:firstLineChars="0"/>
+      </w:pPr>
+      <w:rPr>
+        <w:rFonts w:hint="default" w:ascii="Wingdings" w:hAnsi="Wingdings"/>
+      </w:rPr>
+    </w:lvl>
+    <w:lvl w:ilvl="1" w:tentative="0">
+      <w:start w:val="1"/>
+      <w:numFmt w:val="bullet"/>
+      <w:lvlText w:val=""/>
+      <w:lvlJc w:val="left"/>
+      <w:pPr>
+        <w:tabs>
+          <w:tab w:val="left" w:pos="840"/>
+        </w:tabs>
+        <w:ind w:left="840" w:leftChars="0" w:hanging="420" w:firstLineChars="0"/>
+      </w:pPr>
+      <w:rPr>
+        <w:rFonts w:hint="default" w:ascii="Wingdings" w:hAnsi="Wingdings"/>
+      </w:rPr>
+    </w:lvl>
+    <w:lvl w:ilvl="2" w:tentative="0">
+      <w:start w:val="1"/>
+      <w:numFmt w:val="bullet"/>
+      <w:lvlText w:val=""/>
+      <w:lvlJc w:val="left"/>
+      <w:pPr>
+        <w:tabs>
+          <w:tab w:val="left" w:pos="1260"/>
+        </w:tabs>
+        <w:ind w:left="1260" w:leftChars="0" w:hanging="420" w:firstLineChars="0"/>
+      </w:pPr>
+      <w:rPr>
+        <w:rFonts w:hint="default" w:ascii="Wingdings" w:hAnsi="Wingdings"/>
+      </w:rPr>
+    </w:lvl>
+    <w:lvl w:ilvl="3" w:tentative="0">
+      <w:start w:val="1"/>
+      <w:numFmt w:val="bullet"/>
+      <w:lvlText w:val=""/>
+      <w:lvlJc w:val="left"/>
+      <w:pPr>
+        <w:tabs>
+          <w:tab w:val="left" w:pos="1680"/>
+        </w:tabs>
+        <w:ind w:left="1680" w:leftChars="0" w:hanging="420" w:firstLineChars="0"/>
+      </w:pPr>
+      <w:rPr>
+        <w:rFonts w:hint="default" w:ascii="Wingdings" w:hAnsi="Wingdings"/>
+      </w:rPr>
+    </w:lvl>
+    <w:lvl w:ilvl="4" w:tentative="0">
+      <w:start w:val="1"/>
+      <w:numFmt w:val="bullet"/>
+      <w:lvlText w:val=""/>
+      <w:lvlJc w:val="left"/>
+      <w:pPr>
+        <w:tabs>
+          <w:tab w:val="left" w:pos="2100"/>
+        </w:tabs>
+        <w:ind w:left="2100" w:leftChars="0" w:hanging="420" w:firstLineChars="0"/>
+      </w:pPr>
+      <w:rPr>
+        <w:rFonts w:hint="default" w:ascii="Wingdings" w:hAnsi="Wingdings"/>
+      </w:rPr>
+    </w:lvl>
+    <w:lvl w:ilvl="5" w:tentative="0">
+      <w:start w:val="1"/>
+      <w:numFmt w:val="bullet"/>
+      <w:lvlText w:val=""/>
+      <w:lvlJc w:val="left"/>
+      <w:pPr>
+        <w:tabs>
+          <w:tab w:val="left" w:pos="2520"/>
+        </w:tabs>
+        <w:ind w:left="2520" w:leftChars="0" w:hanging="420" w:firstLineChars="0"/>
+      </w:pPr>
+      <w:rPr>
+        <w:rFonts w:hint="default" w:ascii="Wingdings" w:hAnsi="Wingdings"/>
+      </w:rPr>
+    </w:lvl>
+    <w:lvl w:ilvl="6" w:tentative="0">
+      <w:start w:val="1"/>
+      <w:numFmt w:val="bullet"/>
+      <w:lvlText w:val=""/>
+      <w:lvlJc w:val="left"/>
+      <w:pPr>
+        <w:tabs>
+          <w:tab w:val="left" w:pos="2940"/>
+        </w:tabs>
+        <w:ind w:left="2940" w:leftChars="0" w:hanging="420" w:firstLineChars="0"/>
+      </w:pPr>
+      <w:rPr>
+        <w:rFonts w:hint="default" w:ascii="Wingdings" w:hAnsi="Wingdings"/>
+      </w:rPr>
+    </w:lvl>
+    <w:lvl w:ilvl="7" w:tentative="0">
+      <w:start w:val="1"/>
+      <w:numFmt w:val="bullet"/>
+      <w:lvlText w:val=""/>
+      <w:lvlJc w:val="left"/>
+      <w:pPr>
+        <w:tabs>
+          <w:tab w:val="left" w:pos="3360"/>
+        </w:tabs>
+        <w:ind w:left="3360" w:leftChars="0" w:hanging="420" w:firstLineChars="0"/>
+      </w:pPr>
+      <w:rPr>
+        <w:rFonts w:hint="default" w:ascii="Wingdings" w:hAnsi="Wingdings"/>
+      </w:rPr>
+    </w:lvl>
+    <w:lvl w:ilvl="8" w:tentative="0">
+      <w:start w:val="1"/>
+      <w:numFmt w:val="bullet"/>
+      <w:lvlText w:val=""/>
+      <w:lvlJc w:val="left"/>
+      <w:pPr>
+        <w:tabs>
+          <w:tab w:val="left" w:pos="3780"/>
+        </w:tabs>
+        <w:ind w:left="3780" w:leftChars="0" w:hanging="420" w:firstLineChars="0"/>
+      </w:pPr>
+      <w:rPr>
+        <w:rFonts w:hint="default" w:ascii="Wingdings" w:hAnsi="Wingdings"/>
+      </w:rPr>
+    </w:lvl>
+  </w:abstractNum>
+  <w:abstractNum w:abstractNumId="3">
+    <w:nsid w:val="7F0B2AAD"/>
+    <w:multiLevelType w:val="multilevel"/>
+    <w:tmpl w:val="7F0B2AAD"/>
+    <w:lvl w:ilvl="0" w:tentative="0">
+      <w:start w:val="1"/>
+      <w:numFmt w:val="bullet"/>
+      <w:lvlText w:val=""/>
+      <w:lvlJc w:val="left"/>
+      <w:pPr>
+        <w:tabs>
+          <w:tab w:val="left" w:pos="420"/>
+        </w:tabs>
+        <w:ind w:left="420" w:leftChars="0" w:hanging="420" w:firstLineChars="0"/>
+      </w:pPr>
+      <w:rPr>
+        <w:rFonts w:hint="default" w:ascii="Wingdings" w:hAnsi="Wingdings"/>
+      </w:rPr>
+    </w:lvl>
+    <w:lvl w:ilvl="1" w:tentative="0">
+      <w:start w:val="1"/>
+      <w:numFmt w:val="bullet"/>
+      <w:lvlText w:val=""/>
+      <w:lvlJc w:val="left"/>
+      <w:pPr>
+        <w:tabs>
+          <w:tab w:val="left" w:pos="840"/>
+        </w:tabs>
+        <w:ind w:left="840" w:leftChars="0" w:hanging="420" w:firstLineChars="0"/>
+      </w:pPr>
+      <w:rPr>
+        <w:rFonts w:hint="default" w:ascii="Wingdings" w:hAnsi="Wingdings"/>
+      </w:rPr>
+    </w:lvl>
+    <w:lvl w:ilvl="2" w:tentative="0">
+      <w:start w:val="1"/>
+      <w:numFmt w:val="bullet"/>
+      <w:lvlText w:val=""/>
+      <w:lvlJc w:val="left"/>
+      <w:pPr>
+        <w:tabs>
+          <w:tab w:val="left" w:pos="1260"/>
+        </w:tabs>
+        <w:ind w:left="1260" w:leftChars="0" w:hanging="420" w:firstLineChars="0"/>
+      </w:pPr>
+      <w:rPr>
+        <w:rFonts w:hint="default" w:ascii="Wingdings" w:hAnsi="Wingdings"/>
+      </w:rPr>
+    </w:lvl>
+    <w:lvl w:ilvl="3" w:tentative="0">
+      <w:start w:val="1"/>
+      <w:numFmt w:val="bullet"/>
+      <w:lvlText w:val=""/>
+      <w:lvlJc w:val="left"/>
+      <w:pPr>
+        <w:tabs>
+          <w:tab w:val="left" w:pos="1680"/>
+        </w:tabs>
+        <w:ind w:left="1680" w:leftChars="0" w:hanging="420" w:firstLineChars="0"/>
+      </w:pPr>
+      <w:rPr>
+        <w:rFonts w:hint="default" w:ascii="Wingdings" w:hAnsi="Wingdings"/>
+      </w:rPr>
+    </w:lvl>
+    <w:lvl w:ilvl="4" w:tentative="0">
+      <w:start w:val="1"/>
+      <w:numFmt w:val="bullet"/>
+      <w:lvlText w:val=""/>
+      <w:lvlJc w:val="left"/>
+      <w:pPr>
+        <w:tabs>
+          <w:tab w:val="left" w:pos="2100"/>
+        </w:tabs>
+        <w:ind w:left="2100" w:leftChars="0" w:hanging="420" w:firstLineChars="0"/>
+      </w:pPr>
+      <w:rPr>
+        <w:rFonts w:hint="default" w:ascii="Wingdings" w:hAnsi="Wingdings"/>
+      </w:rPr>
+    </w:lvl>
+    <w:lvl w:ilvl="5" w:tentative="0">
+      <w:start w:val="1"/>
+      <w:numFmt w:val="bullet"/>
+      <w:lvlText w:val=""/>
+      <w:lvlJc w:val="left"/>
+      <w:pPr>
+        <w:tabs>
+          <w:tab w:val="left" w:pos="2520"/>
+        </w:tabs>
+        <w:ind w:left="2520" w:leftChars="0" w:hanging="420" w:firstLineChars="0"/>
+      </w:pPr>
+      <w:rPr>
+        <w:rFonts w:hint="default" w:ascii="Wingdings" w:hAnsi="Wingdings"/>
+      </w:rPr>
+    </w:lvl>
+    <w:lvl w:ilvl="6" w:tentative="0">
+      <w:start w:val="1"/>
+      <w:numFmt w:val="bullet"/>
+      <w:lvlText w:val=""/>
+      <w:lvlJc w:val="left"/>
+      <w:pPr>
+        <w:tabs>
+          <w:tab w:val="left" w:pos="2940"/>
+        </w:tabs>
+        <w:ind w:left="2940" w:leftChars="0" w:hanging="420" w:firstLineChars="0"/>
+      </w:pPr>
+      <w:rPr>
+        <w:rFonts w:hint="default" w:ascii="Wingdings" w:hAnsi="Wingdings"/>
+      </w:rPr>
+    </w:lvl>
+    <w:lvl w:ilvl="7" w:tentative="0">
+      <w:start w:val="1"/>
+      <w:numFmt w:val="bullet"/>
+      <w:lvlText w:val=""/>
+      <w:lvlJc w:val="left"/>
+      <w:pPr>
+        <w:tabs>
+          <w:tab w:val="left" w:pos="3360"/>
+        </w:tabs>
+        <w:ind w:left="3360" w:leftChars="0" w:hanging="420" w:firstLineChars="0"/>
+      </w:pPr>
+      <w:rPr>
+        <w:rFonts w:hint="default" w:ascii="Wingdings" w:hAnsi="Wingdings"/>
+      </w:rPr>
+    </w:lvl>
+    <w:lvl w:ilvl="8" w:tentative="0">
+      <w:start w:val="1"/>
+      <w:numFmt w:val="bullet"/>
+      <w:lvlText w:val=""/>
+      <w:lvlJc w:val="left"/>
+      <w:pPr>
+        <w:tabs>
+          <w:tab w:val="left" w:pos="3780"/>
+        </w:tabs>
+        <w:ind w:left="3780" w:leftChars="0" w:hanging="420" w:firstLineChars="0"/>
+      </w:pPr>
+      <w:rPr>
+        <w:rFonts w:hint="default" w:ascii="Wingdings" w:hAnsi="Wingdings"/>
+      </w:rPr>
+    </w:lvl>
+  </w:abstractNum>
   <w:num w:numId="1">
+    <w:abstractNumId w:val="3"/>
+  </w:num>
+  <w:num w:numId="2">
+    <w:abstractNumId w:val="2"/>
+  </w:num>
+  <w:num w:numId="3">
     <w:abstractNumId w:val="0"/>
+  </w:num>
+  <w:num w:numId="4">
+    <w:abstractNumId w:val="1"/>
   </w:num>
 </w:numbering>
 </file>

</xml_diff>